<commit_message>
Add UML class diagram for project documentation
</commit_message>
<xml_diff>
--- a/TP.docx
+++ b/TP.docx
@@ -4,17 +4,20 @@
   <w:body>
     <w:p>
       <w:pPr>
-        <w:pStyle w:val="Ttulo1"/>
-        <w:jc w:val="center"/>
-      </w:pPr>
-      <w:r>
-        <w:t>Sistema de gestión logística</w:t>
-      </w:r>
-      <w:r>
-        <w:t xml:space="preserve"> – TP5</w:t>
-      </w:r>
-    </w:p>
-    <w:p/>
+        <w:pStyle w:val="Citadestacada"/>
+        <w:rPr>
+          <w:sz w:val="32"/>
+          <w:szCs w:val="32"/>
+        </w:rPr>
+      </w:pPr>
+      <w:r>
+        <w:rPr>
+          <w:sz w:val="32"/>
+          <w:szCs w:val="32"/>
+        </w:rPr>
+        <w:t>Sistema de gestión logística – TP5</w:t>
+      </w:r>
+    </w:p>
     <w:p/>
     <w:p>
       <w:pPr>
@@ -117,10 +120,6 @@
         <w:br/>
         <w:t>2.12 IntervencionCorrectiva</w:t>
       </w:r>
-      <w:r>
-        <w:br/>
-        <w:t>2.13 SistemaLogistica</w:t>
-      </w:r>
     </w:p>
     <w:p>
       <w:pPr>
@@ -163,329 +162,40 @@
     </w:p>
     <w:p>
       <w:pPr>
-        <w:numPr>
-          <w:ilvl w:val="0"/>
-          <w:numId w:val="29"/>
-        </w:numPr>
-      </w:pPr>
-      <w:r>
-        <w:t>Diagrama de secuencia</w:t>
-      </w:r>
-      <w:r>
-        <w:br/>
-        <w:t>4.1 Objetivo del diagrama de secuencia</w:t>
-      </w:r>
-      <w:r>
-        <w:br/>
-        <w:t>4.2 Participantes del flujo</w:t>
-      </w:r>
-      <w:r>
-        <w:br/>
-        <w:t>4.3 Flujo de creación y entrega de un envío</w:t>
-      </w:r>
-      <w:r>
-        <w:br/>
-        <w:t>4.4 Diagrama de secuencia</w:t>
-      </w:r>
-    </w:p>
-    <w:p>
-      <w:pPr>
-        <w:numPr>
-          <w:ilvl w:val="0"/>
-          <w:numId w:val="29"/>
-        </w:numPr>
-      </w:pPr>
+        <w:pStyle w:val="Ttulo2"/>
+      </w:pPr>
+      <w:r>
+        <w:t xml:space="preserve">1 </w:t>
+      </w:r>
+      <w:r>
+        <w:t>Análisis de requisitos</w:t>
+      </w:r>
+    </w:p>
+    <w:p>
+      <w:pPr>
+        <w:pStyle w:val="Ttulo2"/>
+      </w:pPr>
+      <w:r>
+        <w:t>1.1 Introducción</w:t>
+      </w:r>
+    </w:p>
+    <w:p>
+      <w:r>
+        <w:t xml:space="preserve">El presente sistema tiene como objetivo brindar una solución para la gestión logística de una empresa de transporte de carga. Actualmente, la información se administra mediante papel y planillas sueltas, lo que genera errores en el </w:t>
+      </w:r>
       <w:r>
         <w:lastRenderedPageBreak/>
-        <w:t>Documentación CRC</w:t>
-      </w:r>
-      <w:r>
-        <w:br/>
-        <w:t>5.1 Introducción a CRC</w:t>
-      </w:r>
-      <w:r>
-        <w:br/>
-        <w:t>5.2 CRC de Vehiculo</w:t>
-      </w:r>
-      <w:r>
-        <w:br/>
-        <w:t>5.3 CRC de Conductor</w:t>
-      </w:r>
-      <w:r>
-        <w:br/>
-        <w:t>5.4 CRC de Envio</w:t>
-      </w:r>
-      <w:r>
-        <w:br/>
-        <w:t>5.5 CRC de EntregaParcial</w:t>
-      </w:r>
-      <w:r>
-        <w:br/>
-        <w:t>5.6 CRC de CentroDistribucion</w:t>
-      </w:r>
-      <w:r>
-        <w:br/>
-        <w:t>5.7 CRC de IntervencionMantenimiento</w:t>
-      </w:r>
-      <w:r>
-        <w:br/>
-        <w:t>5.8 CRC de SistemaLogistica</w:t>
-      </w:r>
-    </w:p>
-    <w:p>
-      <w:pPr>
-        <w:numPr>
-          <w:ilvl w:val="0"/>
-          <w:numId w:val="29"/>
-        </w:numPr>
-      </w:pPr>
-      <w:r>
-        <w:t>Diseño del proyecto</w:t>
-      </w:r>
-      <w:r>
-        <w:br/>
-        <w:t>6.1 Estructura de carpetas</w:t>
-      </w:r>
-      <w:r>
-        <w:br/>
-        <w:t>6.2 Organización en módulos</w:t>
-      </w:r>
-      <w:r>
-        <w:br/>
-        <w:t>6.3 Separación entre dominio, servicios, persistencia e interfaz</w:t>
-      </w:r>
-      <w:r>
-        <w:br/>
-        <w:t>6.4 Justificación del diseño</w:t>
-      </w:r>
-    </w:p>
-    <w:p>
-      <w:pPr>
-        <w:numPr>
-          <w:ilvl w:val="0"/>
-          <w:numId w:val="29"/>
-        </w:numPr>
-      </w:pPr>
-      <w:r>
-        <w:t>Aplicación de conceptos de programación orientada a objetos</w:t>
-      </w:r>
-      <w:r>
-        <w:br/>
-        <w:t>7.1 Encapsulamiento</w:t>
-      </w:r>
-      <w:r>
-        <w:br/>
-        <w:t>7.2 Herencia</w:t>
-      </w:r>
-      <w:r>
-        <w:br/>
-        <w:t>7.3 Polimorfismo</w:t>
-      </w:r>
-      <w:r>
-        <w:br/>
-        <w:t>7.4 Abstracción</w:t>
-      </w:r>
-      <w:r>
-        <w:br/>
-        <w:t>7.5 Bajo acoplamiento</w:t>
-      </w:r>
-      <w:r>
-        <w:br/>
-        <w:t>7.6 Alta cohesión</w:t>
-      </w:r>
-    </w:p>
-    <w:p>
-      <w:pPr>
-        <w:numPr>
-          <w:ilvl w:val="0"/>
-          <w:numId w:val="29"/>
-        </w:numPr>
-      </w:pPr>
-      <w:r>
-        <w:t>Estructuras de datos utilizadas</w:t>
-      </w:r>
-      <w:r>
-        <w:br/>
-        <w:t>8.1 Listas</w:t>
-      </w:r>
-      <w:r>
-        <w:br/>
-        <w:t>8.2 Diccionarios</w:t>
-      </w:r>
-      <w:r>
-        <w:br/>
-        <w:t>8.3 Archivos JSON</w:t>
-      </w:r>
-      <w:r>
-        <w:br/>
-        <w:t>8.4 Justificación de las estructuras elegidas</w:t>
-      </w:r>
-    </w:p>
-    <w:p>
-      <w:pPr>
-        <w:numPr>
-          <w:ilvl w:val="0"/>
-          <w:numId w:val="29"/>
-        </w:numPr>
-      </w:pPr>
-      <w:r>
-        <w:t>Persistencia de datos</w:t>
-      </w:r>
-      <w:r>
-        <w:br/>
-        <w:t>9.1 Objetivo de la persistencia</w:t>
-      </w:r>
-      <w:r>
-        <w:br/>
-        <w:t>9.2 Persistencia en archivos</w:t>
-      </w:r>
-      <w:r>
-        <w:br/>
-        <w:t>9.3 Carga de datos al iniciar el sistema</w:t>
-      </w:r>
-      <w:r>
-        <w:br/>
-        <w:t>9.4 Guardado de datos al finalizar operaciones</w:t>
-      </w:r>
-      <w:r>
-        <w:br/>
-        <w:t>9.5 Posible cambio futuro a base de datos</w:t>
-      </w:r>
-    </w:p>
-    <w:p>
-      <w:pPr>
-        <w:numPr>
-          <w:ilvl w:val="0"/>
-          <w:numId w:val="29"/>
-        </w:numPr>
-      </w:pPr>
-      <w:r>
-        <w:t>Funcionamiento por consola</w:t>
-      </w:r>
-      <w:r>
-        <w:br/>
-        <w:t>10.1 Menú principal</w:t>
-      </w:r>
-      <w:r>
-        <w:br/>
-        <w:t>10.2 Operaciones disponibles</w:t>
-      </w:r>
-      <w:r>
-        <w:br/>
-        <w:t>10.3 Validaciones principales</w:t>
-      </w:r>
-      <w:r>
-        <w:br/>
-        <w:t>10.4 Restricciones aplicadas: sin break ni continue</w:t>
-      </w:r>
-    </w:p>
-    <w:p>
-      <w:pPr>
-        <w:numPr>
-          <w:ilvl w:val="0"/>
-          <w:numId w:val="29"/>
-        </w:numPr>
-      </w:pPr>
-      <w:r>
-        <w:lastRenderedPageBreak/>
-        <w:t>Datos de prueba</w:t>
-      </w:r>
-      <w:r>
-        <w:br/>
-        <w:t>11.1 Vehículos de prueba</w:t>
-      </w:r>
-      <w:r>
-        <w:br/>
-        <w:t>11.2 Conductores de prueba</w:t>
-      </w:r>
-      <w:r>
-        <w:br/>
-        <w:t>11.3 Centros de distribución de prueba</w:t>
-      </w:r>
-      <w:r>
-        <w:br/>
-        <w:t>11.4 Envíos de prueba</w:t>
-      </w:r>
-      <w:r>
-        <w:br/>
-        <w:t>11.5 Mantenimientos de prueba</w:t>
-      </w:r>
-    </w:p>
-    <w:p>
-      <w:pPr>
-        <w:numPr>
-          <w:ilvl w:val="0"/>
-          <w:numId w:val="29"/>
-        </w:numPr>
-      </w:pPr>
-      <w:r>
-        <w:t>Despliegue en AWS EC2</w:t>
-      </w:r>
-      <w:r>
-        <w:br/>
-        <w:t>12.1 Objetivo del despliegue</w:t>
-      </w:r>
-      <w:r>
-        <w:br/>
-        <w:t>12.2 Requisitos de la máquina virtual</w:t>
-      </w:r>
-      <w:r>
-        <w:br/>
-        <w:t>12.3 Pasos para ejecutar el sistema en EC2</w:t>
-      </w:r>
-      <w:r>
-        <w:br/>
-        <w:t>12.4 Comandos de ejecución</w:t>
-      </w:r>
-    </w:p>
-    <w:p>
-      <w:pPr>
-        <w:numPr>
-          <w:ilvl w:val="0"/>
-          <w:numId w:val="29"/>
-        </w:numPr>
-      </w:pPr>
-      <w:r>
-        <w:t>Informe de decisiones de diseño</w:t>
-      </w:r>
-      <w:r>
-        <w:br/>
-        <w:t>13.1 Decisiones generales</w:t>
-      </w:r>
-      <w:r>
-        <w:br/>
-        <w:t>13.2 Justificación de herencia en vehículos</w:t>
-      </w:r>
-      <w:r>
-        <w:br/>
-        <w:t>13.3 Justificación de herencia en mantenimientos</w:t>
-      </w:r>
-      <w:r>
-        <w:br/>
-        <w:t>13.4 Justificación de SistemaLogistica</w:t>
-      </w:r>
-      <w:r>
-        <w:br/>
-        <w:t>13.5 Justificación de persistencia desacoplada</w:t>
-      </w:r>
-      <w:r>
-        <w:br/>
-        <w:t>13.6 Limitaciones de la primera versión</w:t>
-      </w:r>
-      <w:r>
-        <w:br/>
-        <w:t>13.7 Posibles mejoras futuras</w:t>
-      </w:r>
-    </w:p>
-    <w:p>
-      <w:pPr>
-        <w:numPr>
-          <w:ilvl w:val="0"/>
-          <w:numId w:val="29"/>
-        </w:numPr>
-      </w:pPr>
-      <w:r>
-        <w:t>Conclusión</w:t>
+        <w:t>seguimiento de los envíos y dificultades para auditar el estado de la flota de vehículos.</w:t>
+      </w:r>
+    </w:p>
+    <w:p>
+      <w:r>
+        <w:t>El sistema propuesto permitirá registrar y controlar vehículos, conductores, centros de distribución, envíos, entregas parciales e intervenciones de mantenimiento. Además, deberá permitir consultar información histórica para facilitar la auditoría de las operaciones logísticas.</w:t>
+      </w:r>
+    </w:p>
+    <w:p>
+      <w:r>
+        <w:t>En esta primera iteración, la persistencia de datos se realizará mediante archivos, pero el diseño deberá ser mantenible para permitir en el futuro cambiar o ampliar el mecanismo de persistencia.</w:t>
       </w:r>
     </w:p>
     <w:p/>
@@ -494,46 +204,7 @@
         <w:pStyle w:val="Ttulo2"/>
       </w:pPr>
       <w:r>
-        <w:t xml:space="preserve">1 - </w:t>
-      </w:r>
-      <w:r>
-        <w:t>Análisis de requisitos</w:t>
-      </w:r>
-    </w:p>
-    <w:p>
-      <w:pPr>
-        <w:pStyle w:val="Ttulo2"/>
-      </w:pPr>
-      <w:r>
-        <w:t xml:space="preserve">1.1 - </w:t>
-      </w:r>
-      <w:r>
-        <w:t>Introducción</w:t>
-      </w:r>
-    </w:p>
-    <w:p>
-      <w:r>
-        <w:t>El presente sistema tiene como objetivo brindar una solución para la gestión logística de una empresa de transporte de carga. Actualmente, la información se administra mediante papel y planillas sueltas, lo que genera errores en el seguimiento de los envíos y dificultades para auditar el estado de la flota de vehículos.</w:t>
-      </w:r>
-    </w:p>
-    <w:p>
-      <w:r>
-        <w:t>El sistema propuesto permitirá registrar y controlar vehículos, conductores, centros de distribución, envíos, entregas parciales e intervenciones de mantenimiento. Además, deberá permitir consultar información histórica para facilitar la auditoría de las operaciones logísticas.</w:t>
-      </w:r>
-    </w:p>
-    <w:p>
-      <w:r>
-        <w:t>En esta primera iteración, la persistencia de datos se realizará mediante archivos, pero el diseño deberá ser mantenible para permitir en el futuro cambiar o ampliar el mecanismo de persistencia.</w:t>
-      </w:r>
-    </w:p>
-    <w:p/>
-    <w:p>
-      <w:pPr>
-        <w:pStyle w:val="Ttulo2"/>
-      </w:pPr>
-      <w:r>
-        <w:lastRenderedPageBreak/>
-        <w:t xml:space="preserve">1.2 - </w:t>
+        <w:t xml:space="preserve">1.2 </w:t>
       </w:r>
       <w:r>
         <w:t>Requisitos funcionales</w:t>
@@ -688,7 +359,7 @@
         <w:pStyle w:val="Ttulo2"/>
       </w:pPr>
       <w:r>
-        <w:t xml:space="preserve">1.3 - </w:t>
+        <w:t xml:space="preserve">1.3 </w:t>
       </w:r>
       <w:r>
         <w:t>Requisitos no funcionales</w:t>
@@ -788,7 +459,6 @@
           <w:b/>
           <w:bCs/>
         </w:rPr>
-        <w:lastRenderedPageBreak/>
         <w:t>RNF5 - Diseño mantenible</w:t>
       </w:r>
       <w:r>
@@ -1040,6 +710,7 @@
           <w:b/>
           <w:bCs/>
         </w:rPr>
+        <w:lastRenderedPageBreak/>
         <w:t>RNF15 - Documentación del diseño</w:t>
       </w:r>
       <w:r>
@@ -1061,7 +732,7 @@
         <w:pStyle w:val="Ttulo2"/>
       </w:pPr>
       <w:r>
-        <w:t xml:space="preserve">1.4 - </w:t>
+        <w:t xml:space="preserve">1.4 </w:t>
       </w:r>
       <w:r>
         <w:t>Reglas de negocio</w:t>
@@ -1152,7 +823,6 @@
           <w:b/>
           <w:bCs/>
         </w:rPr>
-        <w:lastRenderedPageBreak/>
         <w:t>RN4 - Restricción de asignación del conductor</w:t>
       </w:r>
       <w:r>
@@ -1394,7 +1064,8 @@
         <w:pStyle w:val="Ttulo2"/>
       </w:pPr>
       <w:r>
-        <w:t xml:space="preserve">1.5 - </w:t>
+        <w:lastRenderedPageBreak/>
+        <w:t xml:space="preserve">1.5 </w:t>
       </w:r>
       <w:r>
         <w:t>Historias de Usuario</w:t>
@@ -1435,6 +1106,9 @@
       <w:r>
         <w:t>omo despachante, quiero asignar un conductor a un vehículo validando su categoría, para cumplir con las normativas de seguridad en el transporte de cargas</w:t>
       </w:r>
+      <w:r>
+        <w:t>.</w:t>
+      </w:r>
     </w:p>
     <w:p>
       <w:r>
@@ -1478,7 +1152,6 @@
           <w:b/>
           <w:bCs/>
         </w:rPr>
-        <w:lastRenderedPageBreak/>
         <w:t>HU5:</w:t>
       </w:r>
       <w:r>
@@ -1514,7 +1187,7 @@
         <w:pStyle w:val="Ttulo2"/>
       </w:pPr>
       <w:r>
-        <w:t xml:space="preserve">1.6 - </w:t>
+        <w:t xml:space="preserve">1.6 </w:t>
       </w:r>
       <w:r>
         <w:t>Alcance de la primera versión</w:t>
@@ -1536,7 +1209,7 @@
         <w:pStyle w:val="Ttulo2"/>
       </w:pPr>
       <w:r>
-        <w:t xml:space="preserve">2 - </w:t>
+        <w:t xml:space="preserve">2 </w:t>
       </w:r>
       <w:r>
         <w:t>Clases principales y responsabilidades</w:t>
@@ -1547,7 +1220,7 @@
         <w:pStyle w:val="Ttulo2"/>
       </w:pPr>
       <w:r>
-        <w:t xml:space="preserve">2.1 - </w:t>
+        <w:t xml:space="preserve">2.1 </w:t>
       </w:r>
       <w:r>
         <w:t>Identificación de clases del dominio</w:t>
@@ -1579,6 +1252,7 @@
         </w:numPr>
       </w:pPr>
       <w:r>
+        <w:lastRenderedPageBreak/>
         <w:t>CamionConvencional</w:t>
       </w:r>
     </w:p>
@@ -1691,20 +1365,7 @@
       </w:r>
     </w:p>
     <w:p>
-      <w:pPr>
-        <w:pStyle w:val="Prrafodelista"/>
-        <w:numPr>
-          <w:ilvl w:val="0"/>
-          <w:numId w:val="15"/>
-        </w:numPr>
-      </w:pPr>
-      <w:r>
-        <w:t>SistemaLogistica</w:t>
-      </w:r>
-    </w:p>
-    <w:p>
-      <w:r>
-        <w:lastRenderedPageBreak/>
+      <w:r>
         <w:t>Estas clases representan conceptos propios del dominio logístico planteado en el enunciado. Se busca modelar elementos reales de la empresa de transporte, como vehículos, conductores, envíos, centros de distribución y mantenimientos.</w:t>
       </w:r>
     </w:p>
@@ -1713,7 +1374,7 @@
         <w:pStyle w:val="Ttulo2"/>
       </w:pPr>
       <w:r>
-        <w:t xml:space="preserve">2.2 - </w:t>
+        <w:t xml:space="preserve">2.2 </w:t>
       </w:r>
       <w:r>
         <w:t>Vehiculo</w:t>
@@ -1805,7 +1466,7 @@
         <w:pStyle w:val="Ttulo2"/>
       </w:pPr>
       <w:r>
-        <w:t xml:space="preserve">2.3 - </w:t>
+        <w:t xml:space="preserve">2.3 </w:t>
       </w:r>
       <w:r>
         <w:t>CamionConvencional</w:t>
@@ -1839,13 +1500,8 @@
           <w:numId w:val="25"/>
         </w:numPr>
       </w:pPr>
-      <w:proofErr w:type="gramStart"/>
-      <w:r>
-        <w:t>Indicar</w:t>
-      </w:r>
-      <w:proofErr w:type="gramEnd"/>
-      <w:r>
-        <w:t xml:space="preserve"> que el tipo de carga permitida es carga general.</w:t>
+      <w:r>
+        <w:t>Indicar que el tipo de carga permitida es carga general.</w:t>
       </w:r>
     </w:p>
     <w:p>
@@ -1858,7 +1514,8 @@
         <w:pStyle w:val="Ttulo2"/>
       </w:pPr>
       <w:r>
-        <w:t xml:space="preserve">2.4 - </w:t>
+        <w:lastRenderedPageBreak/>
+        <w:t xml:space="preserve">2.4 </w:t>
       </w:r>
       <w:r>
         <w:t>VehiculoRefrigerado</w:t>
@@ -1903,14 +1560,8 @@
           <w:numId w:val="23"/>
         </w:numPr>
       </w:pPr>
-      <w:proofErr w:type="gramStart"/>
-      <w:r>
-        <w:lastRenderedPageBreak/>
-        <w:t>Indicar</w:t>
-      </w:r>
-      <w:proofErr w:type="gramEnd"/>
-      <w:r>
-        <w:t xml:space="preserve"> que el tipo de carga permitida corresponde a productos perecederos.</w:t>
+      <w:r>
+        <w:t>Indicar que el tipo de carga permitida corresponde a productos perecederos.</w:t>
       </w:r>
     </w:p>
     <w:p>
@@ -1923,7 +1574,7 @@
         <w:pStyle w:val="Ttulo2"/>
       </w:pPr>
       <w:r>
-        <w:t xml:space="preserve">2.5 - </w:t>
+        <w:t xml:space="preserve">2.5 </w:t>
       </w:r>
       <w:r>
         <w:t>VehiculoCargaPeligrosa</w:t>
@@ -1968,13 +1619,8 @@
           <w:numId w:val="24"/>
         </w:numPr>
       </w:pPr>
-      <w:proofErr w:type="gramStart"/>
-      <w:r>
-        <w:t>Indicar</w:t>
-      </w:r>
-      <w:proofErr w:type="gramEnd"/>
-      <w:r>
-        <w:t xml:space="preserve"> que el tipo de carga permitida es carga peligrosa.</w:t>
+      <w:r>
+        <w:t>Indicar que el tipo de carga permitida es carga peligrosa.</w:t>
       </w:r>
     </w:p>
     <w:p>
@@ -1987,7 +1633,7 @@
         <w:pStyle w:val="Ttulo2"/>
       </w:pPr>
       <w:r>
-        <w:t xml:space="preserve">2.6 - </w:t>
+        <w:t xml:space="preserve">2.6 </w:t>
       </w:r>
       <w:r>
         <w:t>Conductor</w:t>
@@ -2059,14 +1705,8 @@
       </w:r>
     </w:p>
     <w:p>
-      <w:pPr>
-        <w:numPr>
-          <w:ilvl w:val="0"/>
-          <w:numId w:val="21"/>
-        </w:numPr>
-      </w:pPr>
-      <w:r>
-        <w:t>Asignarse o liberarse de un vehículo.</w:t>
+      <w:r>
+        <w:t>Mantener la información sobre el vehículo que tiene asignado.</w:t>
       </w:r>
     </w:p>
     <w:p>
@@ -2079,7 +1719,8 @@
         <w:pStyle w:val="Ttulo2"/>
       </w:pPr>
       <w:r>
-        <w:t xml:space="preserve">2.7 - </w:t>
+        <w:lastRenderedPageBreak/>
+        <w:t xml:space="preserve">2.7 </w:t>
       </w:r>
       <w:r>
         <w:t>Envio</w:t>
@@ -2136,7 +1777,6 @@
         </w:numPr>
       </w:pPr>
       <w:r>
-        <w:lastRenderedPageBreak/>
         <w:t>Gestionar el estado del envío.</w:t>
       </w:r>
     </w:p>
@@ -2183,7 +1823,7 @@
         <w:pStyle w:val="Ttulo2"/>
       </w:pPr>
       <w:r>
-        <w:t xml:space="preserve">2.8 - </w:t>
+        <w:t xml:space="preserve">2.8 </w:t>
       </w:r>
       <w:r>
         <w:t>EntregaParcial</w:t>
@@ -2253,7 +1893,7 @@
         <w:pStyle w:val="Ttulo2"/>
       </w:pPr>
       <w:r>
-        <w:t xml:space="preserve">2.9 - </w:t>
+        <w:t xml:space="preserve">2.9 </w:t>
       </w:r>
       <w:r>
         <w:t>CentroDistribucion</w:t>
@@ -2310,6 +1950,7 @@
         </w:numPr>
       </w:pPr>
       <w:r>
+        <w:lastRenderedPageBreak/>
         <w:t>Registrar el despacho de envíos.</w:t>
       </w:r>
     </w:p>
@@ -2323,7 +1964,7 @@
         <w:pStyle w:val="Ttulo2"/>
       </w:pPr>
       <w:r>
-        <w:t xml:space="preserve">2.10 - </w:t>
+        <w:t xml:space="preserve">2.10 </w:t>
       </w:r>
       <w:r>
         <w:t>IntervencionMantenimiento</w:t>
@@ -2358,7 +1999,6 @@
         </w:numPr>
       </w:pPr>
       <w:r>
-        <w:lastRenderedPageBreak/>
         <w:t>Registrar el kilometraje del vehículo.</w:t>
       </w:r>
     </w:p>
@@ -2405,7 +2045,7 @@
         <w:pStyle w:val="Ttulo2"/>
       </w:pPr>
       <w:r>
-        <w:t xml:space="preserve">2.11 - </w:t>
+        <w:t xml:space="preserve">2.11 </w:t>
       </w:r>
       <w:r>
         <w:t>IntervencionPreventiva</w:t>
@@ -2439,13 +2079,8 @@
           <w:numId w:val="18"/>
         </w:numPr>
       </w:pPr>
-      <w:proofErr w:type="gramStart"/>
-      <w:r>
-        <w:t>Indicar</w:t>
-      </w:r>
-      <w:proofErr w:type="gramEnd"/>
-      <w:r>
-        <w:t xml:space="preserve"> que el tipo de intervención es preventiva.</w:t>
+      <w:r>
+        <w:t>Indicar que el tipo de intervención es preventiva.</w:t>
       </w:r>
     </w:p>
     <w:p>
@@ -2458,7 +2093,7 @@
         <w:pStyle w:val="Ttulo2"/>
       </w:pPr>
       <w:r>
-        <w:t xml:space="preserve">2.12 - </w:t>
+        <w:t xml:space="preserve">2.12 </w:t>
       </w:r>
       <w:r>
         <w:t>IntervencionCorrectiva</w:t>
@@ -2492,13 +2127,8 @@
           <w:numId w:val="17"/>
         </w:numPr>
       </w:pPr>
-      <w:proofErr w:type="gramStart"/>
-      <w:r>
-        <w:t>Indicar</w:t>
-      </w:r>
-      <w:proofErr w:type="gramEnd"/>
-      <w:r>
-        <w:t xml:space="preserve"> que el tipo de intervención es correctiva.</w:t>
+      <w:r>
+        <w:t>Indicar que el tipo de intervención es correctiva.</w:t>
       </w:r>
     </w:p>
     <w:p>
@@ -2511,107 +2141,451 @@
         <w:pStyle w:val="Ttulo2"/>
       </w:pPr>
       <w:r>
-        <w:t xml:space="preserve">2.13 - </w:t>
-      </w:r>
-      <w:r>
-        <w:t>SistemaLogistica</w:t>
-      </w:r>
-    </w:p>
-    <w:p>
-      <w:r>
-        <w:t>La clase SistemaLogistica representa el servicio principal que coordina las operaciones del sistema.</w:t>
-      </w:r>
-    </w:p>
-    <w:p>
-      <w:r>
-        <w:t>Responsabilidades:</w:t>
+        <w:lastRenderedPageBreak/>
+        <w:t>3. Diagrama de clases UML</w:t>
+      </w:r>
+    </w:p>
+    <w:p>
+      <w:pPr>
+        <w:pStyle w:val="Ttulo2"/>
+      </w:pPr>
+      <w:r>
+        <w:t>3.1 Objetivo del diagrama de clases</w:t>
+      </w:r>
+    </w:p>
+    <w:p>
+      <w:r>
+        <w:t>El diagrama de clases UML tiene como objetivo representar la estructura estática del sistema de gestión logística. En este diagrama se muestran las clases principales del dominio, sus atributos, sus métodos, las relaciones entre ellas, las multiplicidades y las jerarquías de herencia.</w:t>
+      </w:r>
+    </w:p>
+    <w:p>
+      <w:r>
+        <w:t>Este diagrama permite visualizar cómo se organiza el sistema antes de pasar a la implementación en código Python. Además, funciona como documentación técnica del diseño propuesto.</w:t>
+      </w:r>
+    </w:p>
+    <w:p>
+      <w:pPr>
+        <w:pStyle w:val="Ttulo2"/>
+      </w:pPr>
+      <w:r>
+        <w:t>3.2 Clases representadas</w:t>
+      </w:r>
+    </w:p>
+    <w:p>
+      <w:r>
+        <w:t>En el diagrama se representan las siguientes clases:</w:t>
       </w:r>
     </w:p>
     <w:p>
       <w:pPr>
         <w:numPr>
           <w:ilvl w:val="0"/>
-          <w:numId w:val="16"/>
+          <w:numId w:val="33"/>
         </w:numPr>
       </w:pPr>
       <w:r>
-        <w:t>Administrar las colecciones de vehículos, conductores, centros de distribución y envíos.</w:t>
+        <w:t>Vehiculo</w:t>
       </w:r>
     </w:p>
     <w:p>
       <w:pPr>
         <w:numPr>
           <w:ilvl w:val="0"/>
-          <w:numId w:val="16"/>
+          <w:numId w:val="33"/>
         </w:numPr>
       </w:pPr>
       <w:r>
-        <w:t>Crear nuevos envíos.</w:t>
+        <w:t>CamionConvencional</w:t>
       </w:r>
     </w:p>
     <w:p>
       <w:pPr>
         <w:numPr>
           <w:ilvl w:val="0"/>
-          <w:numId w:val="16"/>
+          <w:numId w:val="33"/>
         </w:numPr>
       </w:pPr>
       <w:r>
-        <w:t>Asignar conductores a vehículos.</w:t>
+        <w:t>VehiculoRefrigerado</w:t>
       </w:r>
     </w:p>
     <w:p>
       <w:pPr>
         <w:numPr>
           <w:ilvl w:val="0"/>
-          <w:numId w:val="16"/>
+          <w:numId w:val="33"/>
         </w:numPr>
       </w:pPr>
       <w:r>
-        <w:t>Registrar mantenimientos.</w:t>
+        <w:t>VehiculoCargaPeligrosa</w:t>
       </w:r>
     </w:p>
     <w:p>
       <w:pPr>
         <w:numPr>
           <w:ilvl w:val="0"/>
-          <w:numId w:val="16"/>
+          <w:numId w:val="33"/>
         </w:numPr>
       </w:pPr>
       <w:r>
-        <w:lastRenderedPageBreak/>
-        <w:t>Registrar entregas parciales.</w:t>
+        <w:t>Conductor</w:t>
       </w:r>
     </w:p>
     <w:p>
       <w:pPr>
         <w:numPr>
           <w:ilvl w:val="0"/>
-          <w:numId w:val="16"/>
+          <w:numId w:val="33"/>
         </w:numPr>
       </w:pPr>
       <w:r>
-        <w:t>Generar reportes de auditoría.</w:t>
+        <w:t>Envio</w:t>
       </w:r>
     </w:p>
     <w:p>
       <w:pPr>
         <w:numPr>
           <w:ilvl w:val="0"/>
-          <w:numId w:val="16"/>
+          <w:numId w:val="33"/>
         </w:numPr>
       </w:pPr>
       <w:r>
-        <w:t>Coordinar la persistencia de los datos.</w:t>
-      </w:r>
-    </w:p>
-    <w:p>
-      <w:r>
-        <w:t>Esta clase permite centralizar los casos de uso principales sin que las clases del dominio dependan directamente de la interfaz por consola o del mecanismo de almacenamiento.</w:t>
+        <w:t>EntregaParcial</w:t>
+      </w:r>
+    </w:p>
+    <w:p>
+      <w:pPr>
+        <w:numPr>
+          <w:ilvl w:val="0"/>
+          <w:numId w:val="33"/>
+        </w:numPr>
+      </w:pPr>
+      <w:r>
+        <w:t>CentroDistribucion</w:t>
+      </w:r>
+    </w:p>
+    <w:p>
+      <w:pPr>
+        <w:numPr>
+          <w:ilvl w:val="0"/>
+          <w:numId w:val="33"/>
+        </w:numPr>
+      </w:pPr>
+      <w:r>
+        <w:t>IntervencionMantenimiento</w:t>
+      </w:r>
+    </w:p>
+    <w:p>
+      <w:pPr>
+        <w:numPr>
+          <w:ilvl w:val="0"/>
+          <w:numId w:val="33"/>
+        </w:numPr>
+      </w:pPr>
+      <w:r>
+        <w:t>IntervencionPreventiva</w:t>
+      </w:r>
+    </w:p>
+    <w:p>
+      <w:pPr>
+        <w:numPr>
+          <w:ilvl w:val="0"/>
+          <w:numId w:val="33"/>
+        </w:numPr>
+      </w:pPr>
+      <w:r>
+        <w:t>IntervencionCorrectiva</w:t>
+      </w:r>
+    </w:p>
+    <w:p>
+      <w:r>
+        <w:t>Estas clases fueron identificadas a partir del dominio del problema y representan los elementos principales de la operación logística: vehículos, conductores, envíos, centros de distribución y mantenimientos.</w:t>
+      </w:r>
+    </w:p>
+    <w:p>
+      <w:pPr>
+        <w:pStyle w:val="Ttulo2"/>
+      </w:pPr>
+      <w:r>
+        <w:t>3.3 Herencia aplicada</w:t>
+      </w:r>
+    </w:p>
+    <w:p>
+      <w:r>
+        <w:t>Se aplica herencia en dos grupos principales de clases.</w:t>
+      </w:r>
+    </w:p>
+    <w:p>
+      <w:r>
+        <w:t>Por un lado, la clase Vehiculo funciona como clase base para los distintos tipos de vehículos:</w:t>
+      </w:r>
+    </w:p>
+    <w:p>
+      <w:pPr>
+        <w:numPr>
+          <w:ilvl w:val="0"/>
+          <w:numId w:val="34"/>
+        </w:numPr>
+      </w:pPr>
+      <w:r>
+        <w:t>CamionConvencional</w:t>
+      </w:r>
+    </w:p>
+    <w:p>
+      <w:pPr>
+        <w:numPr>
+          <w:ilvl w:val="0"/>
+          <w:numId w:val="34"/>
+        </w:numPr>
+      </w:pPr>
+      <w:r>
+        <w:lastRenderedPageBreak/>
+        <w:t>VehiculoRefrigerado</w:t>
+      </w:r>
+    </w:p>
+    <w:p>
+      <w:pPr>
+        <w:numPr>
+          <w:ilvl w:val="0"/>
+          <w:numId w:val="34"/>
+        </w:numPr>
+      </w:pPr>
+      <w:r>
+        <w:t>VehiculoCargaPeligrosa</w:t>
+      </w:r>
+    </w:p>
+    <w:p>
+      <w:r>
+        <w:t>Estas clases comparten atributos y comportamientos generales, como patente, marca, modelo, año de fabricación, estado operativo y asignación de conductor. Sin embargo, cada una puede especializar el tipo de carga que puede transportar.</w:t>
+      </w:r>
+    </w:p>
+    <w:p>
+      <w:r>
+        <w:t>Por otro lado, la clase IntervencionMantenimiento funciona como clase base para los tipos de mantenimiento:</w:t>
+      </w:r>
+    </w:p>
+    <w:p>
+      <w:pPr>
+        <w:numPr>
+          <w:ilvl w:val="0"/>
+          <w:numId w:val="35"/>
+        </w:numPr>
+      </w:pPr>
+      <w:r>
+        <w:t>IntervencionPreventiva</w:t>
+      </w:r>
+    </w:p>
+    <w:p>
+      <w:pPr>
+        <w:numPr>
+          <w:ilvl w:val="0"/>
+          <w:numId w:val="35"/>
+        </w:numPr>
+      </w:pPr>
+      <w:r>
+        <w:t>IntervencionCorrectiva</w:t>
+      </w:r>
+    </w:p>
+    <w:p>
+      <w:r>
+        <w:t>Ambas intervenciones comparten datos como fecha, kilometraje, descripción y costo, pero se diferencian en el tipo de mantenimiento realizado.</w:t>
+      </w:r>
+    </w:p>
+    <w:p>
+      <w:pPr>
+        <w:pStyle w:val="Ttulo2"/>
+      </w:pPr>
+      <w:r>
+        <w:t>3.4 Asociaciones y multiplicidades</w:t>
+      </w:r>
+    </w:p>
+    <w:p>
+      <w:r>
+        <w:t>El diagrama utiliza asociaciones para representar cómo colaboran las clases entre sí.</w:t>
+      </w:r>
+    </w:p>
+    <w:p>
+      <w:r>
+        <w:t>Un Conductor puede estar asignado a cero o un Vehiculo en un momento determinado. A su vez, un Vehiculo puede tener cero o un Conductor asignado. Esta multiplicidad permite registrar vehículos o conductores aunque todavía no estén asignados.</w:t>
+      </w:r>
+    </w:p>
+    <w:p>
+      <w:r>
+        <w:t>Un Vehiculo puede registrar cero o muchas intervenciones de mantenimiento. Cada intervención queda asociada al vehículo correspondiente.</w:t>
+      </w:r>
+    </w:p>
+    <w:p>
+      <w:r>
+        <w:t>Un Envio utiliza un Vehiculo para realizar el transporte. También se relaciona con un CentroDistribucion de origen y un CentroDistribucion de destino.</w:t>
+      </w:r>
+    </w:p>
+    <w:p>
+      <w:r>
+        <w:t>Un Envio puede contener cero o muchas EntregaParcial, ya que la carga puede repartirse en varios puntos.</w:t>
+      </w:r>
+    </w:p>
+    <w:p>
+      <w:pPr>
+        <w:pStyle w:val="Ttulo2"/>
+      </w:pPr>
+      <w:r>
+        <w:t>3.5 Agregación y composición</w:t>
+      </w:r>
+    </w:p>
+    <w:p>
+      <w:r>
+        <w:t>Se utiliza agregación entre Vehiculo e IntervencionMantenimiento, ya que un vehículo registra intervenciones a lo largo del tiempo. La intervención forma parte del historial del vehículo, pero se la modela como un objeto diferenciado dentro del sistema.</w:t>
+      </w:r>
+    </w:p>
+    <w:p>
+      <w:r>
+        <w:t>Se utiliza composición entre Envio y EntregaParcial, porque las entregas parciales pertenecen al envío. En este diseño, una entrega parcial no tiene sentido aislada sin el envío al que corresponde.</w:t>
       </w:r>
     </w:p>
     <w:p/>
-    <w:p/>
+    <w:p>
+      <w:pPr>
+        <w:pStyle w:val="Ttulo2"/>
+      </w:pPr>
+    </w:p>
+    <w:p>
+      <w:pPr>
+        <w:pStyle w:val="Ttulo2"/>
+      </w:pPr>
+    </w:p>
+    <w:p>
+      <w:pPr>
+        <w:pStyle w:val="Ttulo2"/>
+      </w:pPr>
+    </w:p>
+    <w:p>
+      <w:pPr>
+        <w:pStyle w:val="Ttulo2"/>
+      </w:pPr>
+    </w:p>
+    <w:p>
+      <w:pPr>
+        <w:pStyle w:val="Ttulo2"/>
+      </w:pPr>
+    </w:p>
+    <w:p>
+      <w:pPr>
+        <w:pStyle w:val="Ttulo2"/>
+      </w:pPr>
+    </w:p>
+    <w:p>
+      <w:pPr>
+        <w:pStyle w:val="Ttulo2"/>
+      </w:pPr>
+    </w:p>
+    <w:p>
+      <w:pPr>
+        <w:pStyle w:val="Ttulo2"/>
+      </w:pPr>
+    </w:p>
+    <w:p>
+      <w:pPr>
+        <w:pStyle w:val="Ttulo2"/>
+      </w:pPr>
+    </w:p>
+    <w:p>
+      <w:pPr>
+        <w:pStyle w:val="Ttulo2"/>
+      </w:pPr>
+    </w:p>
+    <w:p>
+      <w:pPr>
+        <w:pStyle w:val="Ttulo2"/>
+      </w:pPr>
+      <w:r>
+        <w:t>3.6 Diagrama de clases</w:t>
+      </w:r>
+    </w:p>
+    <w:p>
+      <w:r>
+        <w:object w:dxaOrig="1520" w:dyaOrig="987" w14:anchorId="5A45E636">
+          <v:shapetype id="_x0000_t75" coordsize="21600,21600" o:spt="75" o:preferrelative="t" path="m@4@5l@4@11@9@11@9@5xe" filled="f" stroked="f">
+            <v:stroke joinstyle="miter"/>
+            <v:formulas>
+              <v:f eqn="if lineDrawn pixelLineWidth 0"/>
+              <v:f eqn="sum @0 1 0"/>
+              <v:f eqn="sum 0 0 @1"/>
+              <v:f eqn="prod @2 1 2"/>
+              <v:f eqn="prod @3 21600 pixelWidth"/>
+              <v:f eqn="prod @3 21600 pixelHeight"/>
+              <v:f eqn="sum @0 0 1"/>
+              <v:f eqn="prod @6 1 2"/>
+              <v:f eqn="prod @7 21600 pixelWidth"/>
+              <v:f eqn="sum @8 21600 0"/>
+              <v:f eqn="prod @7 21600 pixelHeight"/>
+              <v:f eqn="sum @10 21600 0"/>
+            </v:formulas>
+            <v:path o:extrusionok="f" gradientshapeok="t" o:connecttype="rect"/>
+            <o:lock v:ext="edit" aspectratio="t"/>
+          </v:shapetype>
+          <v:shape id="_x0000_i1025" type="#_x0000_t75" style="width:76pt;height:49.35pt" o:ole="">
+            <v:imagedata r:id="rId5" o:title=""/>
+          </v:shape>
+          <o:OLEObject Type="Embed" ProgID="Package" ShapeID="_x0000_i1025" DrawAspect="Icon" ObjectID="_1842125864" r:id="rId6"/>
+        </w:object>
+      </w:r>
+    </w:p>
+    <w:p>
+      <w:r>
+        <w:rPr>
+          <w:noProof/>
+        </w:rPr>
+        <w:lastRenderedPageBreak/>
+        <w:drawing>
+          <wp:inline distT="0" distB="0" distL="0" distR="0" wp14:anchorId="3456ABA7" wp14:editId="101A8650">
+            <wp:extent cx="6206067" cy="7375231"/>
+            <wp:effectExtent l="0" t="0" r="4445" b="0"/>
+            <wp:docPr id="1311793067" name="Imagen 1"/>
+            <wp:cNvGraphicFramePr>
+              <a:graphicFrameLocks xmlns:a="http://schemas.openxmlformats.org/drawingml/2006/main" noChangeAspect="1"/>
+            </wp:cNvGraphicFramePr>
+            <a:graphic xmlns:a="http://schemas.openxmlformats.org/drawingml/2006/main">
+              <a:graphicData uri="http://schemas.openxmlformats.org/drawingml/2006/picture">
+                <pic:pic xmlns:pic="http://schemas.openxmlformats.org/drawingml/2006/picture">
+                  <pic:nvPicPr>
+                    <pic:cNvPr id="0" name="Picture 1"/>
+                    <pic:cNvPicPr>
+                      <a:picLocks noChangeAspect="1" noChangeArrowheads="1"/>
+                    </pic:cNvPicPr>
+                  </pic:nvPicPr>
+                  <pic:blipFill>
+                    <a:blip r:embed="rId7">
+                      <a:extLst>
+                        <a:ext uri="{28A0092B-C50C-407E-A947-70E740481C1C}">
+                          <a14:useLocalDpi xmlns:a14="http://schemas.microsoft.com/office/drawing/2010/main" val="0"/>
+                        </a:ext>
+                      </a:extLst>
+                    </a:blip>
+                    <a:srcRect/>
+                    <a:stretch>
+                      <a:fillRect/>
+                    </a:stretch>
+                  </pic:blipFill>
+                  <pic:spPr bwMode="auto">
+                    <a:xfrm>
+                      <a:off x="0" y="0"/>
+                      <a:ext cx="6215289" cy="7386191"/>
+                    </a:xfrm>
+                    <a:prstGeom prst="rect">
+                      <a:avLst/>
+                    </a:prstGeom>
+                    <a:noFill/>
+                    <a:ln>
+                      <a:noFill/>
+                    </a:ln>
+                  </pic:spPr>
+                </pic:pic>
+              </a:graphicData>
+            </a:graphic>
+          </wp:inline>
+        </w:drawing>
+      </w:r>
+    </w:p>
     <w:sectPr>
       <w:pgSz w:w="11906" w:h="16838"/>
       <w:pgMar w:top="1417" w:right="1701" w:bottom="1417" w:left="1701" w:header="708" w:footer="708" w:gutter="0"/>
@@ -2625,6 +2599,155 @@
 <file path=word/numbering.xml><?xml version="1.0" encoding="utf-8"?>
 <w:numbering xmlns:wpc="http://schemas.microsoft.com/office/word/2010/wordprocessingCanvas" xmlns:cx="http://schemas.microsoft.com/office/drawing/2014/chartex" xmlns:cx1="http://schemas.microsoft.com/office/drawing/2015/9/8/chartex" xmlns:cx2="http://schemas.microsoft.com/office/drawing/2015/10/21/chartex" xmlns:cx3="http://schemas.microsoft.com/office/drawing/2016/5/9/chartex" xmlns:cx4="http://schemas.microsoft.com/office/drawing/2016/5/10/chartex" xmlns:cx5="http://schemas.microsoft.com/office/drawing/2016/5/11/chartex" xmlns:cx6="http://schemas.microsoft.com/office/drawing/2016/5/12/chartex" xmlns:cx7="http://schemas.microsoft.com/office/drawing/2016/5/13/chartex" xmlns:cx8="http://schemas.microsoft.com/office/drawing/2016/5/14/chartex" xmlns:mc="http://schemas.openxmlformats.org/markup-compatibility/2006" xmlns:aink="http://schemas.microsoft.com/office/drawing/2016/ink" xmlns:am3d="http://schemas.microsoft.com/office/drawing/2017/model3d" xmlns:o="urn:schemas-microsoft-com:office:office" xmlns:oel="http://schemas.microsoft.com/office/2019/extlst" xmlns:r="http://schemas.openxmlformats.org/officeDocument/2006/relationships" xmlns:m="http://schemas.openxmlformats.org/officeDocument/2006/math" xmlns:v="urn:schemas-microsoft-com:vml" xmlns:wp14="http://schemas.microsoft.com/office/word/2010/wordprocessingDrawing" xmlns:wp="http://schemas.openxmlformats.org/drawingml/2006/wordprocessingDrawing" xmlns:w10="urn:schemas-microsoft-com:office:word" xmlns:w="http://schemas.openxmlformats.org/wordprocessingml/2006/main" xmlns:w14="http://schemas.microsoft.com/office/word/2010/wordml" xmlns:w15="http://schemas.microsoft.com/office/word/2012/wordml" xmlns:w16cex="http://schemas.microsoft.com/office/word/2018/wordml/cex" xmlns:w16cid="http://schemas.microsoft.com/office/word/2016/wordml/cid" xmlns:w16="http://schemas.microsoft.com/office/word/2018/wordml" xmlns:w16du="http://schemas.microsoft.com/office/word/2023/wordml/word16du" xmlns:w16sdtdh="http://schemas.microsoft.com/office/word/2020/wordml/sdtdatahash" xmlns:w16sdtfl="http://schemas.microsoft.com/office/word/2024/wordml/sdtformatlock" xmlns:w16se="http://schemas.microsoft.com/office/word/2015/wordml/symex" xmlns:wpg="http://schemas.microsoft.com/office/word/2010/wordprocessingGroup" xmlns:wpi="http://schemas.microsoft.com/office/word/2010/wordprocessingInk" xmlns:wne="http://schemas.microsoft.com/office/word/2006/wordml" xmlns:wps="http://schemas.microsoft.com/office/word/2010/wordprocessingShape" mc:Ignorable="w14 w15 w16se w16cid w16 w16cex w16sdtdh w16sdtfl w16du wp14">
   <w:abstractNum w:abstractNumId="0" w15:restartNumberingAfterBreak="0">
+    <w:nsid w:val="016C368F"/>
+    <w:multiLevelType w:val="multilevel"/>
+    <w:tmpl w:val="0D028B4E"/>
+    <w:lvl w:ilvl="0">
+      <w:start w:val="1"/>
+      <w:numFmt w:val="bullet"/>
+      <w:lvlText w:val=""/>
+      <w:lvlJc w:val="left"/>
+      <w:pPr>
+        <w:tabs>
+          <w:tab w:val="num" w:pos="720"/>
+        </w:tabs>
+        <w:ind w:left="720" w:hanging="360"/>
+      </w:pPr>
+      <w:rPr>
+        <w:rFonts w:ascii="Wingdings" w:hAnsi="Wingdings" w:hint="default"/>
+        <w:sz w:val="20"/>
+      </w:rPr>
+    </w:lvl>
+    <w:lvl w:ilvl="1" w:tentative="1">
+      <w:start w:val="1"/>
+      <w:numFmt w:val="bullet"/>
+      <w:lvlText w:val="o"/>
+      <w:lvlJc w:val="left"/>
+      <w:pPr>
+        <w:tabs>
+          <w:tab w:val="num" w:pos="1440"/>
+        </w:tabs>
+        <w:ind w:left="1440" w:hanging="360"/>
+      </w:pPr>
+      <w:rPr>
+        <w:rFonts w:ascii="Courier New" w:hAnsi="Courier New" w:hint="default"/>
+        <w:sz w:val="20"/>
+      </w:rPr>
+    </w:lvl>
+    <w:lvl w:ilvl="2" w:tentative="1">
+      <w:start w:val="1"/>
+      <w:numFmt w:val="bullet"/>
+      <w:lvlText w:val=""/>
+      <w:lvlJc w:val="left"/>
+      <w:pPr>
+        <w:tabs>
+          <w:tab w:val="num" w:pos="2160"/>
+        </w:tabs>
+        <w:ind w:left="2160" w:hanging="360"/>
+      </w:pPr>
+      <w:rPr>
+        <w:rFonts w:ascii="Wingdings" w:hAnsi="Wingdings" w:hint="default"/>
+        <w:sz w:val="20"/>
+      </w:rPr>
+    </w:lvl>
+    <w:lvl w:ilvl="3" w:tentative="1">
+      <w:start w:val="1"/>
+      <w:numFmt w:val="bullet"/>
+      <w:lvlText w:val=""/>
+      <w:lvlJc w:val="left"/>
+      <w:pPr>
+        <w:tabs>
+          <w:tab w:val="num" w:pos="2880"/>
+        </w:tabs>
+        <w:ind w:left="2880" w:hanging="360"/>
+      </w:pPr>
+      <w:rPr>
+        <w:rFonts w:ascii="Wingdings" w:hAnsi="Wingdings" w:hint="default"/>
+        <w:sz w:val="20"/>
+      </w:rPr>
+    </w:lvl>
+    <w:lvl w:ilvl="4" w:tentative="1">
+      <w:start w:val="1"/>
+      <w:numFmt w:val="bullet"/>
+      <w:lvlText w:val=""/>
+      <w:lvlJc w:val="left"/>
+      <w:pPr>
+        <w:tabs>
+          <w:tab w:val="num" w:pos="3600"/>
+        </w:tabs>
+        <w:ind w:left="3600" w:hanging="360"/>
+      </w:pPr>
+      <w:rPr>
+        <w:rFonts w:ascii="Wingdings" w:hAnsi="Wingdings" w:hint="default"/>
+        <w:sz w:val="20"/>
+      </w:rPr>
+    </w:lvl>
+    <w:lvl w:ilvl="5" w:tentative="1">
+      <w:start w:val="1"/>
+      <w:numFmt w:val="bullet"/>
+      <w:lvlText w:val=""/>
+      <w:lvlJc w:val="left"/>
+      <w:pPr>
+        <w:tabs>
+          <w:tab w:val="num" w:pos="4320"/>
+        </w:tabs>
+        <w:ind w:left="4320" w:hanging="360"/>
+      </w:pPr>
+      <w:rPr>
+        <w:rFonts w:ascii="Wingdings" w:hAnsi="Wingdings" w:hint="default"/>
+        <w:sz w:val="20"/>
+      </w:rPr>
+    </w:lvl>
+    <w:lvl w:ilvl="6" w:tentative="1">
+      <w:start w:val="1"/>
+      <w:numFmt w:val="bullet"/>
+      <w:lvlText w:val=""/>
+      <w:lvlJc w:val="left"/>
+      <w:pPr>
+        <w:tabs>
+          <w:tab w:val="num" w:pos="5040"/>
+        </w:tabs>
+        <w:ind w:left="5040" w:hanging="360"/>
+      </w:pPr>
+      <w:rPr>
+        <w:rFonts w:ascii="Wingdings" w:hAnsi="Wingdings" w:hint="default"/>
+        <w:sz w:val="20"/>
+      </w:rPr>
+    </w:lvl>
+    <w:lvl w:ilvl="7" w:tentative="1">
+      <w:start w:val="1"/>
+      <w:numFmt w:val="bullet"/>
+      <w:lvlText w:val=""/>
+      <w:lvlJc w:val="left"/>
+      <w:pPr>
+        <w:tabs>
+          <w:tab w:val="num" w:pos="5760"/>
+        </w:tabs>
+        <w:ind w:left="5760" w:hanging="360"/>
+      </w:pPr>
+      <w:rPr>
+        <w:rFonts w:ascii="Wingdings" w:hAnsi="Wingdings" w:hint="default"/>
+        <w:sz w:val="20"/>
+      </w:rPr>
+    </w:lvl>
+    <w:lvl w:ilvl="8" w:tentative="1">
+      <w:start w:val="1"/>
+      <w:numFmt w:val="bullet"/>
+      <w:lvlText w:val=""/>
+      <w:lvlJc w:val="left"/>
+      <w:pPr>
+        <w:tabs>
+          <w:tab w:val="num" w:pos="6480"/>
+        </w:tabs>
+        <w:ind w:left="6480" w:hanging="360"/>
+      </w:pPr>
+      <w:rPr>
+        <w:rFonts w:ascii="Wingdings" w:hAnsi="Wingdings" w:hint="default"/>
+        <w:sz w:val="20"/>
+      </w:rPr>
+    </w:lvl>
+  </w:abstractNum>
+  <w:abstractNum w:abstractNumId="1" w15:restartNumberingAfterBreak="0">
     <w:nsid w:val="069072E2"/>
     <w:multiLevelType w:val="multilevel"/>
     <w:tmpl w:val="3C526E66"/>
@@ -2773,7 +2896,7 @@
       </w:rPr>
     </w:lvl>
   </w:abstractNum>
-  <w:abstractNum w:abstractNumId="1" w15:restartNumberingAfterBreak="0">
+  <w:abstractNum w:abstractNumId="2" w15:restartNumberingAfterBreak="0">
     <w:nsid w:val="0B6D13A4"/>
     <w:multiLevelType w:val="multilevel"/>
     <w:tmpl w:val="4DDC619A"/>
@@ -2922,7 +3045,7 @@
       </w:rPr>
     </w:lvl>
   </w:abstractNum>
-  <w:abstractNum w:abstractNumId="2" w15:restartNumberingAfterBreak="0">
+  <w:abstractNum w:abstractNumId="3" w15:restartNumberingAfterBreak="0">
     <w:nsid w:val="0B7D6FF4"/>
     <w:multiLevelType w:val="multilevel"/>
     <w:tmpl w:val="68E20220"/>
@@ -3071,7 +3194,7 @@
       </w:rPr>
     </w:lvl>
   </w:abstractNum>
-  <w:abstractNum w:abstractNumId="3" w15:restartNumberingAfterBreak="0">
+  <w:abstractNum w:abstractNumId="4" w15:restartNumberingAfterBreak="0">
     <w:nsid w:val="14C87DB3"/>
     <w:multiLevelType w:val="multilevel"/>
     <w:tmpl w:val="1E40DE5E"/>
@@ -3220,7 +3343,7 @@
       </w:rPr>
     </w:lvl>
   </w:abstractNum>
-  <w:abstractNum w:abstractNumId="4" w15:restartNumberingAfterBreak="0">
+  <w:abstractNum w:abstractNumId="5" w15:restartNumberingAfterBreak="0">
     <w:nsid w:val="15812ABD"/>
     <w:multiLevelType w:val="multilevel"/>
     <w:tmpl w:val="8DA0B75A"/>
@@ -3369,7 +3492,7 @@
       </w:rPr>
     </w:lvl>
   </w:abstractNum>
-  <w:abstractNum w:abstractNumId="5" w15:restartNumberingAfterBreak="0">
+  <w:abstractNum w:abstractNumId="6" w15:restartNumberingAfterBreak="0">
     <w:nsid w:val="16696554"/>
     <w:multiLevelType w:val="multilevel"/>
     <w:tmpl w:val="E9D05B60"/>
@@ -3518,7 +3641,7 @@
       </w:rPr>
     </w:lvl>
   </w:abstractNum>
-  <w:abstractNum w:abstractNumId="6" w15:restartNumberingAfterBreak="0">
+  <w:abstractNum w:abstractNumId="7" w15:restartNumberingAfterBreak="0">
     <w:nsid w:val="18800AB8"/>
     <w:multiLevelType w:val="multilevel"/>
     <w:tmpl w:val="6D527430"/>
@@ -3667,7 +3790,7 @@
       </w:rPr>
     </w:lvl>
   </w:abstractNum>
-  <w:abstractNum w:abstractNumId="7" w15:restartNumberingAfterBreak="0">
+  <w:abstractNum w:abstractNumId="8" w15:restartNumberingAfterBreak="0">
     <w:nsid w:val="199A5A8D"/>
     <w:multiLevelType w:val="multilevel"/>
     <w:tmpl w:val="1620465A"/>
@@ -3816,7 +3939,7 @@
       </w:rPr>
     </w:lvl>
   </w:abstractNum>
-  <w:abstractNum w:abstractNumId="8" w15:restartNumberingAfterBreak="0">
+  <w:abstractNum w:abstractNumId="9" w15:restartNumberingAfterBreak="0">
     <w:nsid w:val="19E467DD"/>
     <w:multiLevelType w:val="multilevel"/>
     <w:tmpl w:val="BE569C92"/>
@@ -3965,7 +4088,7 @@
       </w:rPr>
     </w:lvl>
   </w:abstractNum>
-  <w:abstractNum w:abstractNumId="9" w15:restartNumberingAfterBreak="0">
+  <w:abstractNum w:abstractNumId="10" w15:restartNumberingAfterBreak="0">
     <w:nsid w:val="1C175170"/>
     <w:multiLevelType w:val="multilevel"/>
     <w:tmpl w:val="EF402C80"/>
@@ -4114,7 +4237,7 @@
       </w:rPr>
     </w:lvl>
   </w:abstractNum>
-  <w:abstractNum w:abstractNumId="10" w15:restartNumberingAfterBreak="0">
+  <w:abstractNum w:abstractNumId="11" w15:restartNumberingAfterBreak="0">
     <w:nsid w:val="1C56579D"/>
     <w:multiLevelType w:val="multilevel"/>
     <w:tmpl w:val="DA220E6A"/>
@@ -4263,7 +4386,7 @@
       </w:rPr>
     </w:lvl>
   </w:abstractNum>
-  <w:abstractNum w:abstractNumId="11" w15:restartNumberingAfterBreak="0">
+  <w:abstractNum w:abstractNumId="12" w15:restartNumberingAfterBreak="0">
     <w:nsid w:val="236B004D"/>
     <w:multiLevelType w:val="hybridMultilevel"/>
     <w:tmpl w:val="7BC47CD6"/>
@@ -4376,7 +4499,454 @@
       </w:rPr>
     </w:lvl>
   </w:abstractNum>
-  <w:abstractNum w:abstractNumId="12" w15:restartNumberingAfterBreak="0">
+  <w:abstractNum w:abstractNumId="13" w15:restartNumberingAfterBreak="0">
+    <w:nsid w:val="2AC33154"/>
+    <w:multiLevelType w:val="multilevel"/>
+    <w:tmpl w:val="39D89E6A"/>
+    <w:lvl w:ilvl="0">
+      <w:start w:val="1"/>
+      <w:numFmt w:val="bullet"/>
+      <w:lvlText w:val=""/>
+      <w:lvlJc w:val="left"/>
+      <w:pPr>
+        <w:tabs>
+          <w:tab w:val="num" w:pos="720"/>
+        </w:tabs>
+        <w:ind w:left="720" w:hanging="360"/>
+      </w:pPr>
+      <w:rPr>
+        <w:rFonts w:ascii="Symbol" w:hAnsi="Symbol" w:hint="default"/>
+        <w:sz w:val="20"/>
+      </w:rPr>
+    </w:lvl>
+    <w:lvl w:ilvl="1" w:tentative="1">
+      <w:start w:val="1"/>
+      <w:numFmt w:val="bullet"/>
+      <w:lvlText w:val="o"/>
+      <w:lvlJc w:val="left"/>
+      <w:pPr>
+        <w:tabs>
+          <w:tab w:val="num" w:pos="1440"/>
+        </w:tabs>
+        <w:ind w:left="1440" w:hanging="360"/>
+      </w:pPr>
+      <w:rPr>
+        <w:rFonts w:ascii="Courier New" w:hAnsi="Courier New" w:hint="default"/>
+        <w:sz w:val="20"/>
+      </w:rPr>
+    </w:lvl>
+    <w:lvl w:ilvl="2" w:tentative="1">
+      <w:start w:val="1"/>
+      <w:numFmt w:val="bullet"/>
+      <w:lvlText w:val=""/>
+      <w:lvlJc w:val="left"/>
+      <w:pPr>
+        <w:tabs>
+          <w:tab w:val="num" w:pos="2160"/>
+        </w:tabs>
+        <w:ind w:left="2160" w:hanging="360"/>
+      </w:pPr>
+      <w:rPr>
+        <w:rFonts w:ascii="Wingdings" w:hAnsi="Wingdings" w:hint="default"/>
+        <w:sz w:val="20"/>
+      </w:rPr>
+    </w:lvl>
+    <w:lvl w:ilvl="3" w:tentative="1">
+      <w:start w:val="1"/>
+      <w:numFmt w:val="bullet"/>
+      <w:lvlText w:val=""/>
+      <w:lvlJc w:val="left"/>
+      <w:pPr>
+        <w:tabs>
+          <w:tab w:val="num" w:pos="2880"/>
+        </w:tabs>
+        <w:ind w:left="2880" w:hanging="360"/>
+      </w:pPr>
+      <w:rPr>
+        <w:rFonts w:ascii="Wingdings" w:hAnsi="Wingdings" w:hint="default"/>
+        <w:sz w:val="20"/>
+      </w:rPr>
+    </w:lvl>
+    <w:lvl w:ilvl="4" w:tentative="1">
+      <w:start w:val="1"/>
+      <w:numFmt w:val="bullet"/>
+      <w:lvlText w:val=""/>
+      <w:lvlJc w:val="left"/>
+      <w:pPr>
+        <w:tabs>
+          <w:tab w:val="num" w:pos="3600"/>
+        </w:tabs>
+        <w:ind w:left="3600" w:hanging="360"/>
+      </w:pPr>
+      <w:rPr>
+        <w:rFonts w:ascii="Wingdings" w:hAnsi="Wingdings" w:hint="default"/>
+        <w:sz w:val="20"/>
+      </w:rPr>
+    </w:lvl>
+    <w:lvl w:ilvl="5" w:tentative="1">
+      <w:start w:val="1"/>
+      <w:numFmt w:val="bullet"/>
+      <w:lvlText w:val=""/>
+      <w:lvlJc w:val="left"/>
+      <w:pPr>
+        <w:tabs>
+          <w:tab w:val="num" w:pos="4320"/>
+        </w:tabs>
+        <w:ind w:left="4320" w:hanging="360"/>
+      </w:pPr>
+      <w:rPr>
+        <w:rFonts w:ascii="Wingdings" w:hAnsi="Wingdings" w:hint="default"/>
+        <w:sz w:val="20"/>
+      </w:rPr>
+    </w:lvl>
+    <w:lvl w:ilvl="6" w:tentative="1">
+      <w:start w:val="1"/>
+      <w:numFmt w:val="bullet"/>
+      <w:lvlText w:val=""/>
+      <w:lvlJc w:val="left"/>
+      <w:pPr>
+        <w:tabs>
+          <w:tab w:val="num" w:pos="5040"/>
+        </w:tabs>
+        <w:ind w:left="5040" w:hanging="360"/>
+      </w:pPr>
+      <w:rPr>
+        <w:rFonts w:ascii="Wingdings" w:hAnsi="Wingdings" w:hint="default"/>
+        <w:sz w:val="20"/>
+      </w:rPr>
+    </w:lvl>
+    <w:lvl w:ilvl="7" w:tentative="1">
+      <w:start w:val="1"/>
+      <w:numFmt w:val="bullet"/>
+      <w:lvlText w:val=""/>
+      <w:lvlJc w:val="left"/>
+      <w:pPr>
+        <w:tabs>
+          <w:tab w:val="num" w:pos="5760"/>
+        </w:tabs>
+        <w:ind w:left="5760" w:hanging="360"/>
+      </w:pPr>
+      <w:rPr>
+        <w:rFonts w:ascii="Wingdings" w:hAnsi="Wingdings" w:hint="default"/>
+        <w:sz w:val="20"/>
+      </w:rPr>
+    </w:lvl>
+    <w:lvl w:ilvl="8" w:tentative="1">
+      <w:start w:val="1"/>
+      <w:numFmt w:val="bullet"/>
+      <w:lvlText w:val=""/>
+      <w:lvlJc w:val="left"/>
+      <w:pPr>
+        <w:tabs>
+          <w:tab w:val="num" w:pos="6480"/>
+        </w:tabs>
+        <w:ind w:left="6480" w:hanging="360"/>
+      </w:pPr>
+      <w:rPr>
+        <w:rFonts w:ascii="Wingdings" w:hAnsi="Wingdings" w:hint="default"/>
+        <w:sz w:val="20"/>
+      </w:rPr>
+    </w:lvl>
+  </w:abstractNum>
+  <w:abstractNum w:abstractNumId="14" w15:restartNumberingAfterBreak="0">
+    <w:nsid w:val="2BCB39E8"/>
+    <w:multiLevelType w:val="multilevel"/>
+    <w:tmpl w:val="55787216"/>
+    <w:lvl w:ilvl="0">
+      <w:start w:val="1"/>
+      <w:numFmt w:val="bullet"/>
+      <w:lvlText w:val=""/>
+      <w:lvlJc w:val="left"/>
+      <w:pPr>
+        <w:tabs>
+          <w:tab w:val="num" w:pos="720"/>
+        </w:tabs>
+        <w:ind w:left="720" w:hanging="360"/>
+      </w:pPr>
+      <w:rPr>
+        <w:rFonts w:ascii="Symbol" w:hAnsi="Symbol" w:hint="default"/>
+        <w:sz w:val="20"/>
+      </w:rPr>
+    </w:lvl>
+    <w:lvl w:ilvl="1" w:tentative="1">
+      <w:start w:val="1"/>
+      <w:numFmt w:val="bullet"/>
+      <w:lvlText w:val="o"/>
+      <w:lvlJc w:val="left"/>
+      <w:pPr>
+        <w:tabs>
+          <w:tab w:val="num" w:pos="1440"/>
+        </w:tabs>
+        <w:ind w:left="1440" w:hanging="360"/>
+      </w:pPr>
+      <w:rPr>
+        <w:rFonts w:ascii="Courier New" w:hAnsi="Courier New" w:hint="default"/>
+        <w:sz w:val="20"/>
+      </w:rPr>
+    </w:lvl>
+    <w:lvl w:ilvl="2" w:tentative="1">
+      <w:start w:val="1"/>
+      <w:numFmt w:val="bullet"/>
+      <w:lvlText w:val=""/>
+      <w:lvlJc w:val="left"/>
+      <w:pPr>
+        <w:tabs>
+          <w:tab w:val="num" w:pos="2160"/>
+        </w:tabs>
+        <w:ind w:left="2160" w:hanging="360"/>
+      </w:pPr>
+      <w:rPr>
+        <w:rFonts w:ascii="Wingdings" w:hAnsi="Wingdings" w:hint="default"/>
+        <w:sz w:val="20"/>
+      </w:rPr>
+    </w:lvl>
+    <w:lvl w:ilvl="3" w:tentative="1">
+      <w:start w:val="1"/>
+      <w:numFmt w:val="bullet"/>
+      <w:lvlText w:val=""/>
+      <w:lvlJc w:val="left"/>
+      <w:pPr>
+        <w:tabs>
+          <w:tab w:val="num" w:pos="2880"/>
+        </w:tabs>
+        <w:ind w:left="2880" w:hanging="360"/>
+      </w:pPr>
+      <w:rPr>
+        <w:rFonts w:ascii="Wingdings" w:hAnsi="Wingdings" w:hint="default"/>
+        <w:sz w:val="20"/>
+      </w:rPr>
+    </w:lvl>
+    <w:lvl w:ilvl="4" w:tentative="1">
+      <w:start w:val="1"/>
+      <w:numFmt w:val="bullet"/>
+      <w:lvlText w:val=""/>
+      <w:lvlJc w:val="left"/>
+      <w:pPr>
+        <w:tabs>
+          <w:tab w:val="num" w:pos="3600"/>
+        </w:tabs>
+        <w:ind w:left="3600" w:hanging="360"/>
+      </w:pPr>
+      <w:rPr>
+        <w:rFonts w:ascii="Wingdings" w:hAnsi="Wingdings" w:hint="default"/>
+        <w:sz w:val="20"/>
+      </w:rPr>
+    </w:lvl>
+    <w:lvl w:ilvl="5" w:tentative="1">
+      <w:start w:val="1"/>
+      <w:numFmt w:val="bullet"/>
+      <w:lvlText w:val=""/>
+      <w:lvlJc w:val="left"/>
+      <w:pPr>
+        <w:tabs>
+          <w:tab w:val="num" w:pos="4320"/>
+        </w:tabs>
+        <w:ind w:left="4320" w:hanging="360"/>
+      </w:pPr>
+      <w:rPr>
+        <w:rFonts w:ascii="Wingdings" w:hAnsi="Wingdings" w:hint="default"/>
+        <w:sz w:val="20"/>
+      </w:rPr>
+    </w:lvl>
+    <w:lvl w:ilvl="6" w:tentative="1">
+      <w:start w:val="1"/>
+      <w:numFmt w:val="bullet"/>
+      <w:lvlText w:val=""/>
+      <w:lvlJc w:val="left"/>
+      <w:pPr>
+        <w:tabs>
+          <w:tab w:val="num" w:pos="5040"/>
+        </w:tabs>
+        <w:ind w:left="5040" w:hanging="360"/>
+      </w:pPr>
+      <w:rPr>
+        <w:rFonts w:ascii="Wingdings" w:hAnsi="Wingdings" w:hint="default"/>
+        <w:sz w:val="20"/>
+      </w:rPr>
+    </w:lvl>
+    <w:lvl w:ilvl="7" w:tentative="1">
+      <w:start w:val="1"/>
+      <w:numFmt w:val="bullet"/>
+      <w:lvlText w:val=""/>
+      <w:lvlJc w:val="left"/>
+      <w:pPr>
+        <w:tabs>
+          <w:tab w:val="num" w:pos="5760"/>
+        </w:tabs>
+        <w:ind w:left="5760" w:hanging="360"/>
+      </w:pPr>
+      <w:rPr>
+        <w:rFonts w:ascii="Wingdings" w:hAnsi="Wingdings" w:hint="default"/>
+        <w:sz w:val="20"/>
+      </w:rPr>
+    </w:lvl>
+    <w:lvl w:ilvl="8" w:tentative="1">
+      <w:start w:val="1"/>
+      <w:numFmt w:val="bullet"/>
+      <w:lvlText w:val=""/>
+      <w:lvlJc w:val="left"/>
+      <w:pPr>
+        <w:tabs>
+          <w:tab w:val="num" w:pos="6480"/>
+        </w:tabs>
+        <w:ind w:left="6480" w:hanging="360"/>
+      </w:pPr>
+      <w:rPr>
+        <w:rFonts w:ascii="Wingdings" w:hAnsi="Wingdings" w:hint="default"/>
+        <w:sz w:val="20"/>
+      </w:rPr>
+    </w:lvl>
+  </w:abstractNum>
+  <w:abstractNum w:abstractNumId="15" w15:restartNumberingAfterBreak="0">
+    <w:nsid w:val="30DC174E"/>
+    <w:multiLevelType w:val="multilevel"/>
+    <w:tmpl w:val="8A6E1AA8"/>
+    <w:lvl w:ilvl="0">
+      <w:start w:val="1"/>
+      <w:numFmt w:val="bullet"/>
+      <w:lvlText w:val=""/>
+      <w:lvlJc w:val="left"/>
+      <w:pPr>
+        <w:tabs>
+          <w:tab w:val="num" w:pos="720"/>
+        </w:tabs>
+        <w:ind w:left="720" w:hanging="360"/>
+      </w:pPr>
+      <w:rPr>
+        <w:rFonts w:ascii="Symbol" w:hAnsi="Symbol" w:hint="default"/>
+        <w:sz w:val="20"/>
+      </w:rPr>
+    </w:lvl>
+    <w:lvl w:ilvl="1" w:tentative="1">
+      <w:start w:val="1"/>
+      <w:numFmt w:val="bullet"/>
+      <w:lvlText w:val="o"/>
+      <w:lvlJc w:val="left"/>
+      <w:pPr>
+        <w:tabs>
+          <w:tab w:val="num" w:pos="1440"/>
+        </w:tabs>
+        <w:ind w:left="1440" w:hanging="360"/>
+      </w:pPr>
+      <w:rPr>
+        <w:rFonts w:ascii="Courier New" w:hAnsi="Courier New" w:hint="default"/>
+        <w:sz w:val="20"/>
+      </w:rPr>
+    </w:lvl>
+    <w:lvl w:ilvl="2" w:tentative="1">
+      <w:start w:val="1"/>
+      <w:numFmt w:val="bullet"/>
+      <w:lvlText w:val=""/>
+      <w:lvlJc w:val="left"/>
+      <w:pPr>
+        <w:tabs>
+          <w:tab w:val="num" w:pos="2160"/>
+        </w:tabs>
+        <w:ind w:left="2160" w:hanging="360"/>
+      </w:pPr>
+      <w:rPr>
+        <w:rFonts w:ascii="Wingdings" w:hAnsi="Wingdings" w:hint="default"/>
+        <w:sz w:val="20"/>
+      </w:rPr>
+    </w:lvl>
+    <w:lvl w:ilvl="3" w:tentative="1">
+      <w:start w:val="1"/>
+      <w:numFmt w:val="bullet"/>
+      <w:lvlText w:val=""/>
+      <w:lvlJc w:val="left"/>
+      <w:pPr>
+        <w:tabs>
+          <w:tab w:val="num" w:pos="2880"/>
+        </w:tabs>
+        <w:ind w:left="2880" w:hanging="360"/>
+      </w:pPr>
+      <w:rPr>
+        <w:rFonts w:ascii="Wingdings" w:hAnsi="Wingdings" w:hint="default"/>
+        <w:sz w:val="20"/>
+      </w:rPr>
+    </w:lvl>
+    <w:lvl w:ilvl="4" w:tentative="1">
+      <w:start w:val="1"/>
+      <w:numFmt w:val="bullet"/>
+      <w:lvlText w:val=""/>
+      <w:lvlJc w:val="left"/>
+      <w:pPr>
+        <w:tabs>
+          <w:tab w:val="num" w:pos="3600"/>
+        </w:tabs>
+        <w:ind w:left="3600" w:hanging="360"/>
+      </w:pPr>
+      <w:rPr>
+        <w:rFonts w:ascii="Wingdings" w:hAnsi="Wingdings" w:hint="default"/>
+        <w:sz w:val="20"/>
+      </w:rPr>
+    </w:lvl>
+    <w:lvl w:ilvl="5" w:tentative="1">
+      <w:start w:val="1"/>
+      <w:numFmt w:val="bullet"/>
+      <w:lvlText w:val=""/>
+      <w:lvlJc w:val="left"/>
+      <w:pPr>
+        <w:tabs>
+          <w:tab w:val="num" w:pos="4320"/>
+        </w:tabs>
+        <w:ind w:left="4320" w:hanging="360"/>
+      </w:pPr>
+      <w:rPr>
+        <w:rFonts w:ascii="Wingdings" w:hAnsi="Wingdings" w:hint="default"/>
+        <w:sz w:val="20"/>
+      </w:rPr>
+    </w:lvl>
+    <w:lvl w:ilvl="6" w:tentative="1">
+      <w:start w:val="1"/>
+      <w:numFmt w:val="bullet"/>
+      <w:lvlText w:val=""/>
+      <w:lvlJc w:val="left"/>
+      <w:pPr>
+        <w:tabs>
+          <w:tab w:val="num" w:pos="5040"/>
+        </w:tabs>
+        <w:ind w:left="5040" w:hanging="360"/>
+      </w:pPr>
+      <w:rPr>
+        <w:rFonts w:ascii="Wingdings" w:hAnsi="Wingdings" w:hint="default"/>
+        <w:sz w:val="20"/>
+      </w:rPr>
+    </w:lvl>
+    <w:lvl w:ilvl="7" w:tentative="1">
+      <w:start w:val="1"/>
+      <w:numFmt w:val="bullet"/>
+      <w:lvlText w:val=""/>
+      <w:lvlJc w:val="left"/>
+      <w:pPr>
+        <w:tabs>
+          <w:tab w:val="num" w:pos="5760"/>
+        </w:tabs>
+        <w:ind w:left="5760" w:hanging="360"/>
+      </w:pPr>
+      <w:rPr>
+        <w:rFonts w:ascii="Wingdings" w:hAnsi="Wingdings" w:hint="default"/>
+        <w:sz w:val="20"/>
+      </w:rPr>
+    </w:lvl>
+    <w:lvl w:ilvl="8" w:tentative="1">
+      <w:start w:val="1"/>
+      <w:numFmt w:val="bullet"/>
+      <w:lvlText w:val=""/>
+      <w:lvlJc w:val="left"/>
+      <w:pPr>
+        <w:tabs>
+          <w:tab w:val="num" w:pos="6480"/>
+        </w:tabs>
+        <w:ind w:left="6480" w:hanging="360"/>
+      </w:pPr>
+      <w:rPr>
+        <w:rFonts w:ascii="Wingdings" w:hAnsi="Wingdings" w:hint="default"/>
+        <w:sz w:val="20"/>
+      </w:rPr>
+    </w:lvl>
+  </w:abstractNum>
+  <w:abstractNum w:abstractNumId="16" w15:restartNumberingAfterBreak="0">
     <w:nsid w:val="332C575C"/>
     <w:multiLevelType w:val="multilevel"/>
     <w:tmpl w:val="67B87D84"/>
@@ -4525,7 +5095,7 @@
       </w:rPr>
     </w:lvl>
   </w:abstractNum>
-  <w:abstractNum w:abstractNumId="13" w15:restartNumberingAfterBreak="0">
+  <w:abstractNum w:abstractNumId="17" w15:restartNumberingAfterBreak="0">
     <w:nsid w:val="38431DDD"/>
     <w:multiLevelType w:val="multilevel"/>
     <w:tmpl w:val="BBE4AE96"/>
@@ -4674,7 +5244,7 @@
       </w:rPr>
     </w:lvl>
   </w:abstractNum>
-  <w:abstractNum w:abstractNumId="14" w15:restartNumberingAfterBreak="0">
+  <w:abstractNum w:abstractNumId="18" w15:restartNumberingAfterBreak="0">
     <w:nsid w:val="3D0659C0"/>
     <w:multiLevelType w:val="multilevel"/>
     <w:tmpl w:val="9D4CEA24"/>
@@ -4823,7 +5393,7 @@
       </w:rPr>
     </w:lvl>
   </w:abstractNum>
-  <w:abstractNum w:abstractNumId="15" w15:restartNumberingAfterBreak="0">
+  <w:abstractNum w:abstractNumId="19" w15:restartNumberingAfterBreak="0">
     <w:nsid w:val="4DE760C4"/>
     <w:multiLevelType w:val="multilevel"/>
     <w:tmpl w:val="0D722622"/>
@@ -4972,7 +5542,7 @@
       </w:rPr>
     </w:lvl>
   </w:abstractNum>
-  <w:abstractNum w:abstractNumId="16" w15:restartNumberingAfterBreak="0">
+  <w:abstractNum w:abstractNumId="20" w15:restartNumberingAfterBreak="0">
     <w:nsid w:val="51FC0A43"/>
     <w:multiLevelType w:val="multilevel"/>
     <w:tmpl w:val="E1808806"/>
@@ -5085,7 +5655,156 @@
       </w:pPr>
     </w:lvl>
   </w:abstractNum>
-  <w:abstractNum w:abstractNumId="17" w15:restartNumberingAfterBreak="0">
+  <w:abstractNum w:abstractNumId="21" w15:restartNumberingAfterBreak="0">
+    <w:nsid w:val="54B61B80"/>
+    <w:multiLevelType w:val="multilevel"/>
+    <w:tmpl w:val="5336BD46"/>
+    <w:lvl w:ilvl="0">
+      <w:start w:val="1"/>
+      <w:numFmt w:val="bullet"/>
+      <w:lvlText w:val=""/>
+      <w:lvlJc w:val="left"/>
+      <w:pPr>
+        <w:tabs>
+          <w:tab w:val="num" w:pos="720"/>
+        </w:tabs>
+        <w:ind w:left="720" w:hanging="360"/>
+      </w:pPr>
+      <w:rPr>
+        <w:rFonts w:ascii="Wingdings" w:hAnsi="Wingdings" w:hint="default"/>
+        <w:sz w:val="20"/>
+      </w:rPr>
+    </w:lvl>
+    <w:lvl w:ilvl="1" w:tentative="1">
+      <w:start w:val="1"/>
+      <w:numFmt w:val="bullet"/>
+      <w:lvlText w:val="o"/>
+      <w:lvlJc w:val="left"/>
+      <w:pPr>
+        <w:tabs>
+          <w:tab w:val="num" w:pos="1440"/>
+        </w:tabs>
+        <w:ind w:left="1440" w:hanging="360"/>
+      </w:pPr>
+      <w:rPr>
+        <w:rFonts w:ascii="Courier New" w:hAnsi="Courier New" w:hint="default"/>
+        <w:sz w:val="20"/>
+      </w:rPr>
+    </w:lvl>
+    <w:lvl w:ilvl="2" w:tentative="1">
+      <w:start w:val="1"/>
+      <w:numFmt w:val="bullet"/>
+      <w:lvlText w:val=""/>
+      <w:lvlJc w:val="left"/>
+      <w:pPr>
+        <w:tabs>
+          <w:tab w:val="num" w:pos="2160"/>
+        </w:tabs>
+        <w:ind w:left="2160" w:hanging="360"/>
+      </w:pPr>
+      <w:rPr>
+        <w:rFonts w:ascii="Wingdings" w:hAnsi="Wingdings" w:hint="default"/>
+        <w:sz w:val="20"/>
+      </w:rPr>
+    </w:lvl>
+    <w:lvl w:ilvl="3" w:tentative="1">
+      <w:start w:val="1"/>
+      <w:numFmt w:val="bullet"/>
+      <w:lvlText w:val=""/>
+      <w:lvlJc w:val="left"/>
+      <w:pPr>
+        <w:tabs>
+          <w:tab w:val="num" w:pos="2880"/>
+        </w:tabs>
+        <w:ind w:left="2880" w:hanging="360"/>
+      </w:pPr>
+      <w:rPr>
+        <w:rFonts w:ascii="Wingdings" w:hAnsi="Wingdings" w:hint="default"/>
+        <w:sz w:val="20"/>
+      </w:rPr>
+    </w:lvl>
+    <w:lvl w:ilvl="4" w:tentative="1">
+      <w:start w:val="1"/>
+      <w:numFmt w:val="bullet"/>
+      <w:lvlText w:val=""/>
+      <w:lvlJc w:val="left"/>
+      <w:pPr>
+        <w:tabs>
+          <w:tab w:val="num" w:pos="3600"/>
+        </w:tabs>
+        <w:ind w:left="3600" w:hanging="360"/>
+      </w:pPr>
+      <w:rPr>
+        <w:rFonts w:ascii="Wingdings" w:hAnsi="Wingdings" w:hint="default"/>
+        <w:sz w:val="20"/>
+      </w:rPr>
+    </w:lvl>
+    <w:lvl w:ilvl="5" w:tentative="1">
+      <w:start w:val="1"/>
+      <w:numFmt w:val="bullet"/>
+      <w:lvlText w:val=""/>
+      <w:lvlJc w:val="left"/>
+      <w:pPr>
+        <w:tabs>
+          <w:tab w:val="num" w:pos="4320"/>
+        </w:tabs>
+        <w:ind w:left="4320" w:hanging="360"/>
+      </w:pPr>
+      <w:rPr>
+        <w:rFonts w:ascii="Wingdings" w:hAnsi="Wingdings" w:hint="default"/>
+        <w:sz w:val="20"/>
+      </w:rPr>
+    </w:lvl>
+    <w:lvl w:ilvl="6" w:tentative="1">
+      <w:start w:val="1"/>
+      <w:numFmt w:val="bullet"/>
+      <w:lvlText w:val=""/>
+      <w:lvlJc w:val="left"/>
+      <w:pPr>
+        <w:tabs>
+          <w:tab w:val="num" w:pos="5040"/>
+        </w:tabs>
+        <w:ind w:left="5040" w:hanging="360"/>
+      </w:pPr>
+      <w:rPr>
+        <w:rFonts w:ascii="Wingdings" w:hAnsi="Wingdings" w:hint="default"/>
+        <w:sz w:val="20"/>
+      </w:rPr>
+    </w:lvl>
+    <w:lvl w:ilvl="7" w:tentative="1">
+      <w:start w:val="1"/>
+      <w:numFmt w:val="bullet"/>
+      <w:lvlText w:val=""/>
+      <w:lvlJc w:val="left"/>
+      <w:pPr>
+        <w:tabs>
+          <w:tab w:val="num" w:pos="5760"/>
+        </w:tabs>
+        <w:ind w:left="5760" w:hanging="360"/>
+      </w:pPr>
+      <w:rPr>
+        <w:rFonts w:ascii="Wingdings" w:hAnsi="Wingdings" w:hint="default"/>
+        <w:sz w:val="20"/>
+      </w:rPr>
+    </w:lvl>
+    <w:lvl w:ilvl="8" w:tentative="1">
+      <w:start w:val="1"/>
+      <w:numFmt w:val="bullet"/>
+      <w:lvlText w:val=""/>
+      <w:lvlJc w:val="left"/>
+      <w:pPr>
+        <w:tabs>
+          <w:tab w:val="num" w:pos="6480"/>
+        </w:tabs>
+        <w:ind w:left="6480" w:hanging="360"/>
+      </w:pPr>
+      <w:rPr>
+        <w:rFonts w:ascii="Wingdings" w:hAnsi="Wingdings" w:hint="default"/>
+        <w:sz w:val="20"/>
+      </w:rPr>
+    </w:lvl>
+  </w:abstractNum>
+  <w:abstractNum w:abstractNumId="22" w15:restartNumberingAfterBreak="0">
     <w:nsid w:val="5646166D"/>
     <w:multiLevelType w:val="multilevel"/>
     <w:tmpl w:val="6FE04740"/>
@@ -5234,7 +5953,7 @@
       </w:rPr>
     </w:lvl>
   </w:abstractNum>
-  <w:abstractNum w:abstractNumId="18" w15:restartNumberingAfterBreak="0">
+  <w:abstractNum w:abstractNumId="23" w15:restartNumberingAfterBreak="0">
     <w:nsid w:val="56B35438"/>
     <w:multiLevelType w:val="multilevel"/>
     <w:tmpl w:val="A8AEA97C"/>
@@ -5383,7 +6102,156 @@
       </w:rPr>
     </w:lvl>
   </w:abstractNum>
-  <w:abstractNum w:abstractNumId="19" w15:restartNumberingAfterBreak="0">
+  <w:abstractNum w:abstractNumId="24" w15:restartNumberingAfterBreak="0">
+    <w:nsid w:val="59D34D73"/>
+    <w:multiLevelType w:val="multilevel"/>
+    <w:tmpl w:val="99A60054"/>
+    <w:lvl w:ilvl="0">
+      <w:start w:val="1"/>
+      <w:numFmt w:val="bullet"/>
+      <w:lvlText w:val=""/>
+      <w:lvlJc w:val="left"/>
+      <w:pPr>
+        <w:tabs>
+          <w:tab w:val="num" w:pos="720"/>
+        </w:tabs>
+        <w:ind w:left="720" w:hanging="360"/>
+      </w:pPr>
+      <w:rPr>
+        <w:rFonts w:ascii="Wingdings" w:hAnsi="Wingdings" w:hint="default"/>
+        <w:sz w:val="20"/>
+      </w:rPr>
+    </w:lvl>
+    <w:lvl w:ilvl="1" w:tentative="1">
+      <w:start w:val="1"/>
+      <w:numFmt w:val="bullet"/>
+      <w:lvlText w:val="o"/>
+      <w:lvlJc w:val="left"/>
+      <w:pPr>
+        <w:tabs>
+          <w:tab w:val="num" w:pos="1440"/>
+        </w:tabs>
+        <w:ind w:left="1440" w:hanging="360"/>
+      </w:pPr>
+      <w:rPr>
+        <w:rFonts w:ascii="Courier New" w:hAnsi="Courier New" w:hint="default"/>
+        <w:sz w:val="20"/>
+      </w:rPr>
+    </w:lvl>
+    <w:lvl w:ilvl="2" w:tentative="1">
+      <w:start w:val="1"/>
+      <w:numFmt w:val="bullet"/>
+      <w:lvlText w:val=""/>
+      <w:lvlJc w:val="left"/>
+      <w:pPr>
+        <w:tabs>
+          <w:tab w:val="num" w:pos="2160"/>
+        </w:tabs>
+        <w:ind w:left="2160" w:hanging="360"/>
+      </w:pPr>
+      <w:rPr>
+        <w:rFonts w:ascii="Wingdings" w:hAnsi="Wingdings" w:hint="default"/>
+        <w:sz w:val="20"/>
+      </w:rPr>
+    </w:lvl>
+    <w:lvl w:ilvl="3" w:tentative="1">
+      <w:start w:val="1"/>
+      <w:numFmt w:val="bullet"/>
+      <w:lvlText w:val=""/>
+      <w:lvlJc w:val="left"/>
+      <w:pPr>
+        <w:tabs>
+          <w:tab w:val="num" w:pos="2880"/>
+        </w:tabs>
+        <w:ind w:left="2880" w:hanging="360"/>
+      </w:pPr>
+      <w:rPr>
+        <w:rFonts w:ascii="Wingdings" w:hAnsi="Wingdings" w:hint="default"/>
+        <w:sz w:val="20"/>
+      </w:rPr>
+    </w:lvl>
+    <w:lvl w:ilvl="4" w:tentative="1">
+      <w:start w:val="1"/>
+      <w:numFmt w:val="bullet"/>
+      <w:lvlText w:val=""/>
+      <w:lvlJc w:val="left"/>
+      <w:pPr>
+        <w:tabs>
+          <w:tab w:val="num" w:pos="3600"/>
+        </w:tabs>
+        <w:ind w:left="3600" w:hanging="360"/>
+      </w:pPr>
+      <w:rPr>
+        <w:rFonts w:ascii="Wingdings" w:hAnsi="Wingdings" w:hint="default"/>
+        <w:sz w:val="20"/>
+      </w:rPr>
+    </w:lvl>
+    <w:lvl w:ilvl="5" w:tentative="1">
+      <w:start w:val="1"/>
+      <w:numFmt w:val="bullet"/>
+      <w:lvlText w:val=""/>
+      <w:lvlJc w:val="left"/>
+      <w:pPr>
+        <w:tabs>
+          <w:tab w:val="num" w:pos="4320"/>
+        </w:tabs>
+        <w:ind w:left="4320" w:hanging="360"/>
+      </w:pPr>
+      <w:rPr>
+        <w:rFonts w:ascii="Wingdings" w:hAnsi="Wingdings" w:hint="default"/>
+        <w:sz w:val="20"/>
+      </w:rPr>
+    </w:lvl>
+    <w:lvl w:ilvl="6" w:tentative="1">
+      <w:start w:val="1"/>
+      <w:numFmt w:val="bullet"/>
+      <w:lvlText w:val=""/>
+      <w:lvlJc w:val="left"/>
+      <w:pPr>
+        <w:tabs>
+          <w:tab w:val="num" w:pos="5040"/>
+        </w:tabs>
+        <w:ind w:left="5040" w:hanging="360"/>
+      </w:pPr>
+      <w:rPr>
+        <w:rFonts w:ascii="Wingdings" w:hAnsi="Wingdings" w:hint="default"/>
+        <w:sz w:val="20"/>
+      </w:rPr>
+    </w:lvl>
+    <w:lvl w:ilvl="7" w:tentative="1">
+      <w:start w:val="1"/>
+      <w:numFmt w:val="bullet"/>
+      <w:lvlText w:val=""/>
+      <w:lvlJc w:val="left"/>
+      <w:pPr>
+        <w:tabs>
+          <w:tab w:val="num" w:pos="5760"/>
+        </w:tabs>
+        <w:ind w:left="5760" w:hanging="360"/>
+      </w:pPr>
+      <w:rPr>
+        <w:rFonts w:ascii="Wingdings" w:hAnsi="Wingdings" w:hint="default"/>
+        <w:sz w:val="20"/>
+      </w:rPr>
+    </w:lvl>
+    <w:lvl w:ilvl="8" w:tentative="1">
+      <w:start w:val="1"/>
+      <w:numFmt w:val="bullet"/>
+      <w:lvlText w:val=""/>
+      <w:lvlJc w:val="left"/>
+      <w:pPr>
+        <w:tabs>
+          <w:tab w:val="num" w:pos="6480"/>
+        </w:tabs>
+        <w:ind w:left="6480" w:hanging="360"/>
+      </w:pPr>
+      <w:rPr>
+        <w:rFonts w:ascii="Wingdings" w:hAnsi="Wingdings" w:hint="default"/>
+        <w:sz w:val="20"/>
+      </w:rPr>
+    </w:lvl>
+  </w:abstractNum>
+  <w:abstractNum w:abstractNumId="25" w15:restartNumberingAfterBreak="0">
     <w:nsid w:val="5C0453B5"/>
     <w:multiLevelType w:val="multilevel"/>
     <w:tmpl w:val="0F8A820C"/>
@@ -5532,7 +6400,7 @@
       </w:rPr>
     </w:lvl>
   </w:abstractNum>
-  <w:abstractNum w:abstractNumId="20" w15:restartNumberingAfterBreak="0">
+  <w:abstractNum w:abstractNumId="26" w15:restartNumberingAfterBreak="0">
     <w:nsid w:val="64B00278"/>
     <w:multiLevelType w:val="hybridMultilevel"/>
     <w:tmpl w:val="CD28EF80"/>
@@ -5645,7 +6513,7 @@
       </w:rPr>
     </w:lvl>
   </w:abstractNum>
-  <w:abstractNum w:abstractNumId="21" w15:restartNumberingAfterBreak="0">
+  <w:abstractNum w:abstractNumId="27" w15:restartNumberingAfterBreak="0">
     <w:nsid w:val="698D1561"/>
     <w:multiLevelType w:val="multilevel"/>
     <w:tmpl w:val="D82A7284"/>
@@ -5794,7 +6662,7 @@
       </w:rPr>
     </w:lvl>
   </w:abstractNum>
-  <w:abstractNum w:abstractNumId="22" w15:restartNumberingAfterBreak="0">
+  <w:abstractNum w:abstractNumId="28" w15:restartNumberingAfterBreak="0">
     <w:nsid w:val="6A4075A6"/>
     <w:multiLevelType w:val="multilevel"/>
     <w:tmpl w:val="DE0AC670"/>
@@ -5943,7 +6811,7 @@
       </w:rPr>
     </w:lvl>
   </w:abstractNum>
-  <w:abstractNum w:abstractNumId="23" w15:restartNumberingAfterBreak="0">
+  <w:abstractNum w:abstractNumId="29" w15:restartNumberingAfterBreak="0">
     <w:nsid w:val="6ABA2566"/>
     <w:multiLevelType w:val="multilevel"/>
     <w:tmpl w:val="AB1E4A6C"/>
@@ -6056,7 +6924,7 @@
       </w:pPr>
     </w:lvl>
   </w:abstractNum>
-  <w:abstractNum w:abstractNumId="24" w15:restartNumberingAfterBreak="0">
+  <w:abstractNum w:abstractNumId="30" w15:restartNumberingAfterBreak="0">
     <w:nsid w:val="6C181F06"/>
     <w:multiLevelType w:val="multilevel"/>
     <w:tmpl w:val="D714B83A"/>
@@ -6205,7 +7073,7 @@
       </w:rPr>
     </w:lvl>
   </w:abstractNum>
-  <w:abstractNum w:abstractNumId="25" w15:restartNumberingAfterBreak="0">
+  <w:abstractNum w:abstractNumId="31" w15:restartNumberingAfterBreak="0">
     <w:nsid w:val="73B247CC"/>
     <w:multiLevelType w:val="multilevel"/>
     <w:tmpl w:val="1FCC590C"/>
@@ -6354,7 +7222,7 @@
       </w:rPr>
     </w:lvl>
   </w:abstractNum>
-  <w:abstractNum w:abstractNumId="26" w15:restartNumberingAfterBreak="0">
+  <w:abstractNum w:abstractNumId="32" w15:restartNumberingAfterBreak="0">
     <w:nsid w:val="757C548C"/>
     <w:multiLevelType w:val="multilevel"/>
     <w:tmpl w:val="D096BB34"/>
@@ -6503,7 +7371,7 @@
       </w:rPr>
     </w:lvl>
   </w:abstractNum>
-  <w:abstractNum w:abstractNumId="27" w15:restartNumberingAfterBreak="0">
+  <w:abstractNum w:abstractNumId="33" w15:restartNumberingAfterBreak="0">
     <w:nsid w:val="78680D7E"/>
     <w:multiLevelType w:val="multilevel"/>
     <w:tmpl w:val="82D839BC"/>
@@ -6652,7 +7520,7 @@
       </w:rPr>
     </w:lvl>
   </w:abstractNum>
-  <w:abstractNum w:abstractNumId="28" w15:restartNumberingAfterBreak="0">
+  <w:abstractNum w:abstractNumId="34" w15:restartNumberingAfterBreak="0">
     <w:nsid w:val="7CEF3633"/>
     <w:multiLevelType w:val="multilevel"/>
     <w:tmpl w:val="FA8C540E"/>
@@ -6802,91 +7670,109 @@
     </w:lvl>
   </w:abstractNum>
   <w:num w:numId="1" w16cid:durableId="991713832">
+    <w:abstractNumId w:val="5"/>
+  </w:num>
+  <w:num w:numId="2" w16cid:durableId="1607032024">
+    <w:abstractNumId w:val="2"/>
+  </w:num>
+  <w:num w:numId="3" w16cid:durableId="650409830">
     <w:abstractNumId w:val="4"/>
   </w:num>
-  <w:num w:numId="2" w16cid:durableId="1607032024">
+  <w:num w:numId="4" w16cid:durableId="1360594245">
+    <w:abstractNumId w:val="25"/>
+  </w:num>
+  <w:num w:numId="5" w16cid:durableId="882790408">
+    <w:abstractNumId w:val="19"/>
+  </w:num>
+  <w:num w:numId="6" w16cid:durableId="637805758">
+    <w:abstractNumId w:val="8"/>
+  </w:num>
+  <w:num w:numId="7" w16cid:durableId="1514153078">
+    <w:abstractNumId w:val="16"/>
+  </w:num>
+  <w:num w:numId="8" w16cid:durableId="1353996797">
     <w:abstractNumId w:val="1"/>
   </w:num>
-  <w:num w:numId="3" w16cid:durableId="650409830">
+  <w:num w:numId="9" w16cid:durableId="2018648305">
     <w:abstractNumId w:val="3"/>
   </w:num>
-  <w:num w:numId="4" w16cid:durableId="1360594245">
-    <w:abstractNumId w:val="19"/>
+  <w:num w:numId="10" w16cid:durableId="307902396">
+    <w:abstractNumId w:val="34"/>
   </w:num>
-  <w:num w:numId="5" w16cid:durableId="882790408">
+  <w:num w:numId="11" w16cid:durableId="476537202">
+    <w:abstractNumId w:val="30"/>
+  </w:num>
+  <w:num w:numId="12" w16cid:durableId="506480353">
+    <w:abstractNumId w:val="9"/>
+  </w:num>
+  <w:num w:numId="13" w16cid:durableId="660962421">
+    <w:abstractNumId w:val="33"/>
+  </w:num>
+  <w:num w:numId="14" w16cid:durableId="989673404">
+    <w:abstractNumId w:val="26"/>
+  </w:num>
+  <w:num w:numId="15" w16cid:durableId="803815906">
+    <w:abstractNumId w:val="12"/>
+  </w:num>
+  <w:num w:numId="16" w16cid:durableId="864440774">
+    <w:abstractNumId w:val="28"/>
+  </w:num>
+  <w:num w:numId="17" w16cid:durableId="1587418745">
+    <w:abstractNumId w:val="18"/>
+  </w:num>
+  <w:num w:numId="18" w16cid:durableId="443698354">
+    <w:abstractNumId w:val="31"/>
+  </w:num>
+  <w:num w:numId="19" w16cid:durableId="220488261">
+    <w:abstractNumId w:val="22"/>
+  </w:num>
+  <w:num w:numId="20" w16cid:durableId="400832514">
+    <w:abstractNumId w:val="6"/>
+  </w:num>
+  <w:num w:numId="21" w16cid:durableId="932976082">
+    <w:abstractNumId w:val="23"/>
+  </w:num>
+  <w:num w:numId="22" w16cid:durableId="1796101508">
+    <w:abstractNumId w:val="10"/>
+  </w:num>
+  <w:num w:numId="23" w16cid:durableId="1030256123">
+    <w:abstractNumId w:val="32"/>
+  </w:num>
+  <w:num w:numId="24" w16cid:durableId="1554777667">
+    <w:abstractNumId w:val="17"/>
+  </w:num>
+  <w:num w:numId="25" w16cid:durableId="1449399633">
+    <w:abstractNumId w:val="27"/>
+  </w:num>
+  <w:num w:numId="26" w16cid:durableId="1805738161">
+    <w:abstractNumId w:val="7"/>
+  </w:num>
+  <w:num w:numId="27" w16cid:durableId="1644430915">
+    <w:abstractNumId w:val="11"/>
+  </w:num>
+  <w:num w:numId="28" w16cid:durableId="1814523761">
+    <w:abstractNumId w:val="20"/>
+  </w:num>
+  <w:num w:numId="29" w16cid:durableId="1779056248">
+    <w:abstractNumId w:val="29"/>
+  </w:num>
+  <w:num w:numId="30" w16cid:durableId="23141832">
     <w:abstractNumId w:val="15"/>
   </w:num>
-  <w:num w:numId="6" w16cid:durableId="637805758">
-    <w:abstractNumId w:val="7"/>
+  <w:num w:numId="31" w16cid:durableId="683244322">
+    <w:abstractNumId w:val="14"/>
   </w:num>
-  <w:num w:numId="7" w16cid:durableId="1514153078">
-    <w:abstractNumId w:val="12"/>
+  <w:num w:numId="32" w16cid:durableId="1621716286">
+    <w:abstractNumId w:val="13"/>
   </w:num>
-  <w:num w:numId="8" w16cid:durableId="1353996797">
+  <w:num w:numId="33" w16cid:durableId="1009068008">
+    <w:abstractNumId w:val="21"/>
+  </w:num>
+  <w:num w:numId="34" w16cid:durableId="1025057743">
     <w:abstractNumId w:val="0"/>
   </w:num>
-  <w:num w:numId="9" w16cid:durableId="2018648305">
-    <w:abstractNumId w:val="2"/>
-  </w:num>
-  <w:num w:numId="10" w16cid:durableId="307902396">
-    <w:abstractNumId w:val="28"/>
-  </w:num>
-  <w:num w:numId="11" w16cid:durableId="476537202">
+  <w:num w:numId="35" w16cid:durableId="1998417695">
     <w:abstractNumId w:val="24"/>
-  </w:num>
-  <w:num w:numId="12" w16cid:durableId="506480353">
-    <w:abstractNumId w:val="8"/>
-  </w:num>
-  <w:num w:numId="13" w16cid:durableId="660962421">
-    <w:abstractNumId w:val="27"/>
-  </w:num>
-  <w:num w:numId="14" w16cid:durableId="989673404">
-    <w:abstractNumId w:val="20"/>
-  </w:num>
-  <w:num w:numId="15" w16cid:durableId="803815906">
-    <w:abstractNumId w:val="11"/>
-  </w:num>
-  <w:num w:numId="16" w16cid:durableId="864440774">
-    <w:abstractNumId w:val="22"/>
-  </w:num>
-  <w:num w:numId="17" w16cid:durableId="1587418745">
-    <w:abstractNumId w:val="14"/>
-  </w:num>
-  <w:num w:numId="18" w16cid:durableId="443698354">
-    <w:abstractNumId w:val="25"/>
-  </w:num>
-  <w:num w:numId="19" w16cid:durableId="220488261">
-    <w:abstractNumId w:val="17"/>
-  </w:num>
-  <w:num w:numId="20" w16cid:durableId="400832514">
-    <w:abstractNumId w:val="5"/>
-  </w:num>
-  <w:num w:numId="21" w16cid:durableId="932976082">
-    <w:abstractNumId w:val="18"/>
-  </w:num>
-  <w:num w:numId="22" w16cid:durableId="1796101508">
-    <w:abstractNumId w:val="9"/>
-  </w:num>
-  <w:num w:numId="23" w16cid:durableId="1030256123">
-    <w:abstractNumId w:val="26"/>
-  </w:num>
-  <w:num w:numId="24" w16cid:durableId="1554777667">
-    <w:abstractNumId w:val="13"/>
-  </w:num>
-  <w:num w:numId="25" w16cid:durableId="1449399633">
-    <w:abstractNumId w:val="21"/>
-  </w:num>
-  <w:num w:numId="26" w16cid:durableId="1805738161">
-    <w:abstractNumId w:val="6"/>
-  </w:num>
-  <w:num w:numId="27" w16cid:durableId="1644430915">
-    <w:abstractNumId w:val="10"/>
-  </w:num>
-  <w:num w:numId="28" w16cid:durableId="1814523761">
-    <w:abstractNumId w:val="16"/>
-  </w:num>
-  <w:num w:numId="29" w16cid:durableId="1779056248">
-    <w:abstractNumId w:val="23"/>
   </w:num>
 </w:numbering>
 </file>
@@ -7493,6 +8379,7 @@
   <w:style w:type="character" w:default="1" w:styleId="Fuentedeprrafopredeter">
     <w:name w:val="Default Paragraph Font"/>
     <w:uiPriority w:val="1"/>
+    <w:semiHidden/>
     <w:unhideWhenUsed/>
   </w:style>
   <w:style w:type="table" w:default="1" w:styleId="Tablanormal">

</xml_diff>